<commit_message>
Atualização do numero da Sprint
</commit_message>
<xml_diff>
--- a/Documentação/Word/Sprint22_Task030_Elaborar_Definição_dos_Atores.docx
+++ b/Documentação/Word/Sprint22_Task030_Elaborar_Definição_dos_Atores.docx
@@ -1,6 +1,6 @@
 
 <file path=word/document.xml><?xml version="1.0" encoding="utf-8"?>
-<w:document xmlns:wpc="http://schemas.microsoft.com/office/word/2010/wordprocessingCanvas" xmlns:mc="http://schemas.openxmlformats.org/markup-compatibility/2006" xmlns:o="urn:schemas-microsoft-com:office:office" xmlns:r="http://schemas.openxmlformats.org/officeDocument/2006/relationships" xmlns:m="http://schemas.openxmlformats.org/officeDocument/2006/math" xmlns:v="urn:schemas-microsoft-com:vml" xmlns:wp14="http://schemas.microsoft.com/office/word/2010/wordprocessingDrawing" xmlns:wp="http://schemas.openxmlformats.org/drawingml/2006/wordprocessingDrawing" xmlns:w10="urn:schemas-microsoft-com:office:word" xmlns:w="http://schemas.openxmlformats.org/wordprocessingml/2006/main" xmlns:w14="http://schemas.microsoft.com/office/word/2010/wordml" xmlns:wpg="http://schemas.microsoft.com/office/word/2010/wordprocessingGroup" xmlns:wpi="http://schemas.microsoft.com/office/word/2010/wordprocessingInk" xmlns:wne="http://schemas.microsoft.com/office/word/2006/wordml" xmlns:wps="http://schemas.microsoft.com/office/word/2010/wordprocessingShape" mc:Ignorable="w14 wp14">
+<w:document xmlns:wpc="http://schemas.microsoft.com/office/word/2010/wordprocessingCanvas" xmlns:cx="http://schemas.microsoft.com/office/drawing/2014/chartex" xmlns:cx1="http://schemas.microsoft.com/office/drawing/2015/9/8/chartex" xmlns:cx2="http://schemas.microsoft.com/office/drawing/2015/10/21/chartex" xmlns:cx3="http://schemas.microsoft.com/office/drawing/2016/5/9/chartex" xmlns:cx4="http://schemas.microsoft.com/office/drawing/2016/5/10/chartex" xmlns:cx5="http://schemas.microsoft.com/office/drawing/2016/5/11/chartex" xmlns:cx6="http://schemas.microsoft.com/office/drawing/2016/5/12/chartex" xmlns:cx7="http://schemas.microsoft.com/office/drawing/2016/5/13/chartex" xmlns:cx8="http://schemas.microsoft.com/office/drawing/2016/5/14/chartex" xmlns:mc="http://schemas.openxmlformats.org/markup-compatibility/2006" xmlns:aink="http://schemas.microsoft.com/office/drawing/2016/ink" xmlns:am3d="http://schemas.microsoft.com/office/drawing/2017/model3d" xmlns:o="urn:schemas-microsoft-com:office:office" xmlns:oel="http://schemas.microsoft.com/office/2019/extlst" xmlns:r="http://schemas.openxmlformats.org/officeDocument/2006/relationships" xmlns:m="http://schemas.openxmlformats.org/officeDocument/2006/math" xmlns:v="urn:schemas-microsoft-com:vml" xmlns:wp14="http://schemas.microsoft.com/office/word/2010/wordprocessingDrawing" xmlns:wp="http://schemas.openxmlformats.org/drawingml/2006/wordprocessingDrawing" xmlns:w10="urn:schemas-microsoft-com:office:word" xmlns:w="http://schemas.openxmlformats.org/wordprocessingml/2006/main" xmlns:w14="http://schemas.microsoft.com/office/word/2010/wordml" xmlns:w15="http://schemas.microsoft.com/office/word/2012/wordml" xmlns:w16cex="http://schemas.microsoft.com/office/word/2018/wordml/cex" xmlns:w16cid="http://schemas.microsoft.com/office/word/2016/wordml/cid" xmlns:w16="http://schemas.microsoft.com/office/word/2018/wordml" xmlns:w16sdtdh="http://schemas.microsoft.com/office/word/2020/wordml/sdtdatahash" xmlns:w16se="http://schemas.microsoft.com/office/word/2015/wordml/symex" xmlns:wpg="http://schemas.microsoft.com/office/word/2010/wordprocessingGroup" xmlns:wpi="http://schemas.microsoft.com/office/word/2010/wordprocessingInk" xmlns:wne="http://schemas.microsoft.com/office/word/2006/wordml" xmlns:wps="http://schemas.microsoft.com/office/word/2010/wordprocessingShape" mc:Ignorable="w14 w15 w16se w16cid w16 w16cex w16sdtdh wp14">
   <w:body>
     <w:p>
       <w:pPr>
@@ -32,7 +32,7 @@
                     </pic:cNvPicPr>
                   </pic:nvPicPr>
                   <pic:blipFill>
-                    <a:blip r:embed="rId7" cstate="print">
+                    <a:blip r:embed="rId6" cstate="print">
                       <a:extLst>
                         <a:ext uri="{28A0092B-C50C-407E-A947-70E740481C1C}">
                           <a14:useLocalDpi xmlns:a14="http://schemas.microsoft.com/office/drawing/2010/main" val="0"/>
@@ -139,7 +139,21 @@
                 <w:b/>
                 <w:bCs/>
               </w:rPr>
-              <w:t>Sprint #</w:t>
+              <w:t xml:space="preserve">Sprint </w:t>
+            </w:r>
+            <w:r>
+              <w:rPr>
+                <w:b/>
+                <w:bCs/>
+              </w:rPr>
+              <w:t>#</w:t>
+            </w:r>
+            <w:r>
+              <w:rPr>
+                <w:b/>
+                <w:bCs/>
+              </w:rPr>
+              <w:t>22</w:t>
             </w:r>
           </w:p>
         </w:tc>
@@ -159,17 +173,8 @@
                 <w:b/>
                 <w:bCs/>
               </w:rPr>
-              <w:t xml:space="preserve">Start </w:t>
-            </w:r>
-            <w:proofErr w:type="gramStart"/>
-            <w:r>
-              <w:rPr>
-                <w:b/>
-                <w:bCs/>
-              </w:rPr>
-              <w:t>Date:</w:t>
-            </w:r>
-            <w:proofErr w:type="gramEnd"/>
+              <w:t>Start Date:</w:t>
+            </w:r>
             <w:r>
               <w:rPr>
                 <w:b/>
@@ -196,17 +201,8 @@
                 <w:b/>
                 <w:bCs/>
               </w:rPr>
-              <w:t xml:space="preserve">Final </w:t>
-            </w:r>
-            <w:proofErr w:type="gramStart"/>
-            <w:r>
-              <w:rPr>
-                <w:b/>
-                <w:bCs/>
-              </w:rPr>
-              <w:t>Date:</w:t>
-            </w:r>
-            <w:proofErr w:type="gramEnd"/>
+              <w:t>Final Date:</w:t>
+            </w:r>
             <w:r>
               <w:rPr>
                 <w:b/>
@@ -276,21 +272,12 @@
               </w:rPr>
             </w:pPr>
             <w:proofErr w:type="spellStart"/>
-            <w:proofErr w:type="gramStart"/>
-            <w:r>
-              <w:rPr>
-                <w:b/>
-                <w:bCs/>
-              </w:rPr>
-              <w:t>civitas</w:t>
-            </w:r>
-            <w:proofErr w:type="gramEnd"/>
-            <w:r>
-              <w:rPr>
-                <w:b/>
-                <w:bCs/>
-              </w:rPr>
-              <w:t>-documentation</w:t>
+            <w:r>
+              <w:rPr>
+                <w:b/>
+                <w:bCs/>
+              </w:rPr>
+              <w:t>civitas-documentation</w:t>
             </w:r>
             <w:proofErr w:type="spellEnd"/>
           </w:p>
@@ -402,10 +389,10 @@
         <w:tblLook w:val="04A0" w:firstRow="1" w:lastRow="0" w:firstColumn="1" w:lastColumn="0" w:noHBand="0" w:noVBand="1"/>
       </w:tblPr>
       <w:tblGrid>
-        <w:gridCol w:w="791"/>
-        <w:gridCol w:w="6201"/>
-        <w:gridCol w:w="1539"/>
-        <w:gridCol w:w="1670"/>
+        <w:gridCol w:w="754"/>
+        <w:gridCol w:w="6234"/>
+        <w:gridCol w:w="1541"/>
+        <w:gridCol w:w="1672"/>
       </w:tblGrid>
       <w:tr>
         <w:tc>
@@ -627,21 +614,12 @@
                 <w:bCs/>
               </w:rPr>
             </w:pPr>
-            <w:proofErr w:type="spellStart"/>
-            <w:r>
-              <w:rPr>
-                <w:b/>
-                <w:bCs/>
-              </w:rPr>
-              <w:t>Task</w:t>
-            </w:r>
-            <w:proofErr w:type="spellEnd"/>
-            <w:r>
-              <w:rPr>
-                <w:b/>
-                <w:bCs/>
-              </w:rPr>
-              <w:t xml:space="preserve"> </w:t>
+            <w:r>
+              <w:rPr>
+                <w:b/>
+                <w:bCs/>
+              </w:rPr>
+              <w:t xml:space="preserve">Task </w:t>
             </w:r>
             <w:proofErr w:type="spellStart"/>
             <w:r>
@@ -864,30 +842,22 @@
     </w:p>
     <w:p>
       <w:r>
-        <w:t>Desenvolver o tó</w:t>
-      </w:r>
-      <w:r>
-        <w:t>pico 3.3 - Definição de Atores.</w:t>
+        <w:t>Desenvolver o tópico 3.3 - Definição de Atores.</w:t>
       </w:r>
     </w:p>
     <w:p>
       <w:r>
-        <w:t xml:space="preserve">Descrever todos os atores presentes no sistema, apresentando suas responsabilidades, permissões e interações com </w:t>
-      </w:r>
-      <w:r>
-        <w:t>as funcionalidades disponíveis.</w:t>
+        <w:t>Descrever todos os atores presentes no sistema, apresentando suas responsabilidades, permissões e interações com as funcionalidades disponíveis.</w:t>
       </w:r>
     </w:p>
     <w:p>
       <w:r>
-        <w:t>Além da descrição textual, inserir corretamente o Diagrama de Atores, contendo legenda e formatação conforme o padrão adota</w:t>
-      </w:r>
-      <w:r>
-        <w:t>do no restante da documentação.</w:t>
+        <w:t>Além da descrição textual, inserir corretamente o Diagrama de Atores, contendo legenda e formatação conforme o padrão adotado no restante da documentação.</w:t>
       </w:r>
     </w:p>
     <w:p>
       <w:r>
+        <w:lastRenderedPageBreak/>
         <w:t>Cada ator deve possuir uma descrição clara de seu papel dentro do sistema.</w:t>
       </w:r>
     </w:p>
@@ -946,15 +916,7 @@
     <w:p/>
     <w:p>
       <w:r>
-        <w:t xml:space="preserve">Durante a </w:t>
-      </w:r>
-      <w:proofErr w:type="spellStart"/>
-      <w:r>
-        <w:t>sprint</w:t>
-      </w:r>
-      <w:proofErr w:type="spellEnd"/>
-      <w:r>
-        <w:t xml:space="preserve">, foram documentados os requisitos funcionais e os atores do </w:t>
+        <w:t xml:space="preserve">Durante a sprint, foram documentados os requisitos funcionais e os atores do </w:t>
       </w:r>
       <w:proofErr w:type="spellStart"/>
       <w:r>
@@ -967,20 +929,15 @@
     </w:p>
     <w:p>
       <w:r>
-        <w:t xml:space="preserve">Não houve desenvolvimento de novas telas ou alterações no código, pois a </w:t>
-      </w:r>
-      <w:proofErr w:type="spellStart"/>
-      <w:r>
-        <w:t>sprint</w:t>
-      </w:r>
-      <w:proofErr w:type="spellEnd"/>
-      <w:r>
-        <w:t xml:space="preserve"> teve foco documental. Como resultado, houve maior alinhamento entre documentação e sistema. O controle detalhado de permissões ficou previsto para uma etapa futura. As entregas foram validadas por meio de revisão manual e comparação com o código-fonte.</w:t>
+        <w:t>Não houve desenvolvimento de novas telas ou alterações no código, pois a sprint teve foco documental. Como resultado, houve maior alinhamento entre documentação e sistema. O controle detalhado de permissões ficou previsto para uma etapa futura. As entregas foram validadas por meio de revisão manual e comparação com o código-fonte.</w:t>
       </w:r>
       <w:r>
         <w:t xml:space="preserve"> </w:t>
       </w:r>
       <w:r>
+        <w:rPr>
+          <w:noProof/>
+        </w:rPr>
         <w:drawing>
           <wp:inline distT="0" distB="0" distL="0" distR="0" wp14:anchorId="235259D1" wp14:editId="294C65CB">
             <wp:extent cx="5612130" cy="4251325"/>
@@ -997,7 +954,7 @@
                     <pic:cNvPicPr/>
                   </pic:nvPicPr>
                   <pic:blipFill>
-                    <a:blip r:embed="rId8"/>
+                    <a:blip r:embed="rId7"/>
                     <a:stretch>
                       <a:fillRect/>
                     </a:stretch>
@@ -1023,8 +980,6 @@
         <w:shd w:val="clear" w:color="auto" w:fill="000000" w:themeFill="text1"/>
         <w:jc w:val="center"/>
       </w:pPr>
-      <w:bookmarkStart w:id="0" w:name="_GoBack"/>
-      <w:bookmarkEnd w:id="0"/>
       <w:r>
         <w:rPr>
           <w:b/>
@@ -1047,7 +1002,7 @@
 </file>
 
 <file path=word/endnotes.xml><?xml version="1.0" encoding="utf-8"?>
-<w:endnotes xmlns:wpc="http://schemas.microsoft.com/office/word/2010/wordprocessingCanvas" xmlns:mc="http://schemas.openxmlformats.org/markup-compatibility/2006" xmlns:o="urn:schemas-microsoft-com:office:office" xmlns:r="http://schemas.openxmlformats.org/officeDocument/2006/relationships" xmlns:m="http://schemas.openxmlformats.org/officeDocument/2006/math" xmlns:v="urn:schemas-microsoft-com:vml" xmlns:wp14="http://schemas.microsoft.com/office/word/2010/wordprocessingDrawing" xmlns:wp="http://schemas.openxmlformats.org/drawingml/2006/wordprocessingDrawing" xmlns:w10="urn:schemas-microsoft-com:office:word" xmlns:w="http://schemas.openxmlformats.org/wordprocessingml/2006/main" xmlns:w14="http://schemas.microsoft.com/office/word/2010/wordml" xmlns:wpg="http://schemas.microsoft.com/office/word/2010/wordprocessingGroup" xmlns:wpi="http://schemas.microsoft.com/office/word/2010/wordprocessingInk" xmlns:wne="http://schemas.microsoft.com/office/word/2006/wordml" xmlns:wps="http://schemas.microsoft.com/office/word/2010/wordprocessingShape" mc:Ignorable="w14 wp14">
+<w:endnotes xmlns:wpc="http://schemas.microsoft.com/office/word/2010/wordprocessingCanvas" xmlns:cx="http://schemas.microsoft.com/office/drawing/2014/chartex" xmlns:cx1="http://schemas.microsoft.com/office/drawing/2015/9/8/chartex" xmlns:cx2="http://schemas.microsoft.com/office/drawing/2015/10/21/chartex" xmlns:cx3="http://schemas.microsoft.com/office/drawing/2016/5/9/chartex" xmlns:cx4="http://schemas.microsoft.com/office/drawing/2016/5/10/chartex" xmlns:cx5="http://schemas.microsoft.com/office/drawing/2016/5/11/chartex" xmlns:cx6="http://schemas.microsoft.com/office/drawing/2016/5/12/chartex" xmlns:cx7="http://schemas.microsoft.com/office/drawing/2016/5/13/chartex" xmlns:cx8="http://schemas.microsoft.com/office/drawing/2016/5/14/chartex" xmlns:mc="http://schemas.openxmlformats.org/markup-compatibility/2006" xmlns:aink="http://schemas.microsoft.com/office/drawing/2016/ink" xmlns:am3d="http://schemas.microsoft.com/office/drawing/2017/model3d" xmlns:o="urn:schemas-microsoft-com:office:office" xmlns:oel="http://schemas.microsoft.com/office/2019/extlst" xmlns:r="http://schemas.openxmlformats.org/officeDocument/2006/relationships" xmlns:m="http://schemas.openxmlformats.org/officeDocument/2006/math" xmlns:v="urn:schemas-microsoft-com:vml" xmlns:wp14="http://schemas.microsoft.com/office/word/2010/wordprocessingDrawing" xmlns:wp="http://schemas.openxmlformats.org/drawingml/2006/wordprocessingDrawing" xmlns:w10="urn:schemas-microsoft-com:office:word" xmlns:w="http://schemas.openxmlformats.org/wordprocessingml/2006/main" xmlns:w14="http://schemas.microsoft.com/office/word/2010/wordml" xmlns:w15="http://schemas.microsoft.com/office/word/2012/wordml" xmlns:w16cex="http://schemas.microsoft.com/office/word/2018/wordml/cex" xmlns:w16cid="http://schemas.microsoft.com/office/word/2016/wordml/cid" xmlns:w16="http://schemas.microsoft.com/office/word/2018/wordml" xmlns:w16sdtdh="http://schemas.microsoft.com/office/word/2020/wordml/sdtdatahash" xmlns:w16se="http://schemas.microsoft.com/office/word/2015/wordml/symex" xmlns:wpg="http://schemas.microsoft.com/office/word/2010/wordprocessingGroup" xmlns:wpi="http://schemas.microsoft.com/office/word/2010/wordprocessingInk" xmlns:wne="http://schemas.microsoft.com/office/word/2006/wordml" xmlns:wps="http://schemas.microsoft.com/office/word/2010/wordprocessingShape" mc:Ignorable="w14 w15 w16se w16cid w16 w16cex w16sdtdh wp14">
   <w:endnote w:type="separator" w:id="-1">
     <w:p>
       <w:pPr>
@@ -1072,7 +1027,7 @@
 </file>
 
 <file path=word/footnotes.xml><?xml version="1.0" encoding="utf-8"?>
-<w:footnotes xmlns:wpc="http://schemas.microsoft.com/office/word/2010/wordprocessingCanvas" xmlns:mc="http://schemas.openxmlformats.org/markup-compatibility/2006" xmlns:o="urn:schemas-microsoft-com:office:office" xmlns:r="http://schemas.openxmlformats.org/officeDocument/2006/relationships" xmlns:m="http://schemas.openxmlformats.org/officeDocument/2006/math" xmlns:v="urn:schemas-microsoft-com:vml" xmlns:wp14="http://schemas.microsoft.com/office/word/2010/wordprocessingDrawing" xmlns:wp="http://schemas.openxmlformats.org/drawingml/2006/wordprocessingDrawing" xmlns:w10="urn:schemas-microsoft-com:office:word" xmlns:w="http://schemas.openxmlformats.org/wordprocessingml/2006/main" xmlns:w14="http://schemas.microsoft.com/office/word/2010/wordml" xmlns:wpg="http://schemas.microsoft.com/office/word/2010/wordprocessingGroup" xmlns:wpi="http://schemas.microsoft.com/office/word/2010/wordprocessingInk" xmlns:wne="http://schemas.microsoft.com/office/word/2006/wordml" xmlns:wps="http://schemas.microsoft.com/office/word/2010/wordprocessingShape" mc:Ignorable="w14 wp14">
+<w:footnotes xmlns:wpc="http://schemas.microsoft.com/office/word/2010/wordprocessingCanvas" xmlns:cx="http://schemas.microsoft.com/office/drawing/2014/chartex" xmlns:cx1="http://schemas.microsoft.com/office/drawing/2015/9/8/chartex" xmlns:cx2="http://schemas.microsoft.com/office/drawing/2015/10/21/chartex" xmlns:cx3="http://schemas.microsoft.com/office/drawing/2016/5/9/chartex" xmlns:cx4="http://schemas.microsoft.com/office/drawing/2016/5/10/chartex" xmlns:cx5="http://schemas.microsoft.com/office/drawing/2016/5/11/chartex" xmlns:cx6="http://schemas.microsoft.com/office/drawing/2016/5/12/chartex" xmlns:cx7="http://schemas.microsoft.com/office/drawing/2016/5/13/chartex" xmlns:cx8="http://schemas.microsoft.com/office/drawing/2016/5/14/chartex" xmlns:mc="http://schemas.openxmlformats.org/markup-compatibility/2006" xmlns:aink="http://schemas.microsoft.com/office/drawing/2016/ink" xmlns:am3d="http://schemas.microsoft.com/office/drawing/2017/model3d" xmlns:o="urn:schemas-microsoft-com:office:office" xmlns:oel="http://schemas.microsoft.com/office/2019/extlst" xmlns:r="http://schemas.openxmlformats.org/officeDocument/2006/relationships" xmlns:m="http://schemas.openxmlformats.org/officeDocument/2006/math" xmlns:v="urn:schemas-microsoft-com:vml" xmlns:wp14="http://schemas.microsoft.com/office/word/2010/wordprocessingDrawing" xmlns:wp="http://schemas.openxmlformats.org/drawingml/2006/wordprocessingDrawing" xmlns:w10="urn:schemas-microsoft-com:office:word" xmlns:w="http://schemas.openxmlformats.org/wordprocessingml/2006/main" xmlns:w14="http://schemas.microsoft.com/office/word/2010/wordml" xmlns:w15="http://schemas.microsoft.com/office/word/2012/wordml" xmlns:w16cex="http://schemas.microsoft.com/office/word/2018/wordml/cex" xmlns:w16cid="http://schemas.microsoft.com/office/word/2016/wordml/cid" xmlns:w16="http://schemas.microsoft.com/office/word/2018/wordml" xmlns:w16sdtdh="http://schemas.microsoft.com/office/word/2020/wordml/sdtdatahash" xmlns:w16se="http://schemas.microsoft.com/office/word/2015/wordml/symex" xmlns:wpg="http://schemas.microsoft.com/office/word/2010/wordprocessingGroup" xmlns:wpi="http://schemas.microsoft.com/office/word/2010/wordprocessingInk" xmlns:wne="http://schemas.microsoft.com/office/word/2006/wordml" xmlns:wps="http://schemas.microsoft.com/office/word/2010/wordprocessingShape" mc:Ignorable="w14 w15 w16se w16cid w16 w16cex w16sdtdh wp14">
   <w:footnote w:type="separator" w:id="-1">
     <w:p>
       <w:pPr>
@@ -1097,7 +1052,7 @@
 </file>
 
 <file path=word/styles.xml><?xml version="1.0" encoding="utf-8"?>
-<w:styles xmlns:mc="http://schemas.openxmlformats.org/markup-compatibility/2006" xmlns:r="http://schemas.openxmlformats.org/officeDocument/2006/relationships" xmlns:w="http://schemas.openxmlformats.org/wordprocessingml/2006/main" xmlns:w14="http://schemas.microsoft.com/office/word/2010/wordml" mc:Ignorable="w14">
+<w:styles xmlns:mc="http://schemas.openxmlformats.org/markup-compatibility/2006" xmlns:r="http://schemas.openxmlformats.org/officeDocument/2006/relationships" xmlns:w="http://schemas.openxmlformats.org/wordprocessingml/2006/main" xmlns:w14="http://schemas.microsoft.com/office/word/2010/wordml" xmlns:w15="http://schemas.microsoft.com/office/word/2012/wordml" xmlns:w16cex="http://schemas.microsoft.com/office/word/2018/wordml/cex" xmlns:w16cid="http://schemas.microsoft.com/office/word/2016/wordml/cid" xmlns:w16="http://schemas.microsoft.com/office/word/2018/wordml" xmlns:w16sdtdh="http://schemas.microsoft.com/office/word/2020/wordml/sdtdatahash" xmlns:w16se="http://schemas.microsoft.com/office/word/2015/wordml/symex" mc:Ignorable="w14 w15 w16se w16cid w16 w16cex w16sdtdh">
   <w:docDefaults>
     <w:rPrDefault>
       <w:rPr>
@@ -1115,918 +1070,383 @@
       </w:pPr>
     </w:pPrDefault>
   </w:docDefaults>
-  <w:latentStyles w:defLockedState="0" w:defUIPriority="99" w:defSemiHidden="1" w:defUnhideWhenUsed="1" w:defQFormat="0" w:count="267">
-    <w:lsdException w:name="Normal" w:semiHidden="0" w:uiPriority="0" w:unhideWhenUsed="0" w:qFormat="1"/>
-    <w:lsdException w:name="heading 1" w:semiHidden="0" w:uiPriority="9" w:unhideWhenUsed="0" w:qFormat="1"/>
-    <w:lsdException w:name="heading 2" w:uiPriority="9" w:qFormat="1"/>
-    <w:lsdException w:name="heading 3" w:uiPriority="9" w:qFormat="1"/>
-    <w:lsdException w:name="heading 4" w:uiPriority="9" w:qFormat="1"/>
-    <w:lsdException w:name="heading 5" w:uiPriority="9" w:qFormat="1"/>
-    <w:lsdException w:name="heading 6" w:uiPriority="9" w:qFormat="1"/>
-    <w:lsdException w:name="heading 7" w:uiPriority="9" w:qFormat="1"/>
-    <w:lsdException w:name="heading 8" w:uiPriority="9" w:qFormat="1"/>
-    <w:lsdException w:name="heading 9" w:uiPriority="9" w:qFormat="1"/>
-    <w:lsdException w:name="toc 1" w:uiPriority="39"/>
-    <w:lsdException w:name="toc 2" w:uiPriority="39"/>
-    <w:lsdException w:name="toc 3" w:uiPriority="39"/>
-    <w:lsdException w:name="toc 4" w:uiPriority="39"/>
-    <w:lsdException w:name="toc 5" w:uiPriority="39"/>
-    <w:lsdException w:name="toc 6" w:uiPriority="39"/>
-    <w:lsdException w:name="toc 7" w:uiPriority="39"/>
-    <w:lsdException w:name="toc 8" w:uiPriority="39"/>
-    <w:lsdException w:name="toc 9" w:uiPriority="39"/>
-    <w:lsdException w:name="caption" w:uiPriority="35" w:qFormat="1"/>
-    <w:lsdException w:name="Title" w:semiHidden="0" w:uiPriority="10" w:unhideWhenUsed="0" w:qFormat="1"/>
-    <w:lsdException w:name="Default Paragraph Font" w:uiPriority="1"/>
-    <w:lsdException w:name="Subtitle" w:semiHidden="0" w:uiPriority="11" w:unhideWhenUsed="0" w:qFormat="1"/>
-    <w:lsdException w:name="Strong" w:semiHidden="0" w:uiPriority="22" w:unhideWhenUsed="0" w:qFormat="1"/>
-    <w:lsdException w:name="Emphasis" w:semiHidden="0" w:uiPriority="20" w:unhideWhenUsed="0" w:qFormat="1"/>
-    <w:lsdException w:name="Table Grid" w:semiHidden="0" w:uiPriority="39" w:unhideWhenUsed="0"/>
-    <w:lsdException w:name="Placeholder Text" w:unhideWhenUsed="0"/>
-    <w:lsdException w:name="No Spacing" w:semiHidden="0" w:uiPriority="1" w:unhideWhenUsed="0" w:qFormat="1"/>
-    <w:lsdException w:name="Light Shading" w:semiHidden="0" w:uiPriority="60" w:unhideWhenUsed="0"/>
-    <w:lsdException w:name="Light List" w:semiHidden="0" w:uiPriority="61" w:unhideWhenUsed="0"/>
-    <w:lsdException w:name="Light Grid" w:semiHidden="0" w:uiPriority="62" w:unhideWhenUsed="0"/>
-    <w:lsdException w:name="Medium Shading 1" w:semiHidden="0" w:uiPriority="63" w:unhideWhenUsed="0"/>
-    <w:lsdException w:name="Medium Shading 2" w:semiHidden="0" w:uiPriority="64" w:unhideWhenUsed="0"/>
-    <w:lsdException w:name="Medium List 1" w:semiHidden="0" w:uiPriority="65" w:unhideWhenUsed="0"/>
-    <w:lsdException w:name="Medium List 2" w:semiHidden="0" w:uiPriority="66" w:unhideWhenUsed="0"/>
-    <w:lsdException w:name="Medium Grid 1" w:semiHidden="0" w:uiPriority="67" w:unhideWhenUsed="0"/>
-    <w:lsdException w:name="Medium Grid 2" w:semiHidden="0" w:uiPriority="68" w:unhideWhenUsed="0"/>
-    <w:lsdException w:name="Medium Grid 3" w:semiHidden="0" w:uiPriority="69" w:unhideWhenUsed="0"/>
-    <w:lsdException w:name="Dark List" w:semiHidden="0" w:uiPriority="70" w:unhideWhenUsed="0"/>
-    <w:lsdException w:name="Colorful Shading" w:semiHidden="0" w:uiPriority="71" w:unhideWhenUsed="0"/>
-    <w:lsdException w:name="Colorful List" w:semiHidden="0" w:uiPriority="72" w:unhideWhenUsed="0"/>
-    <w:lsdException w:name="Colorful Grid" w:semiHidden="0" w:uiPriority="73" w:unhideWhenUsed="0"/>
-    <w:lsdException w:name="Light Shading Accent 1" w:semiHidden="0" w:uiPriority="60" w:unhideWhenUsed="0"/>
-    <w:lsdException w:name="Light List Accent 1" w:semiHidden="0" w:uiPriority="61" w:unhideWhenUsed="0"/>
-    <w:lsdException w:name="Light Grid Accent 1" w:semiHidden="0" w:uiPriority="62" w:unhideWhenUsed="0"/>
-    <w:lsdException w:name="Medium Shading 1 Accent 1" w:semiHidden="0" w:uiPriority="63" w:unhideWhenUsed="0"/>
-    <w:lsdException w:name="Medium Shading 2 Accent 1" w:semiHidden="0" w:uiPriority="64" w:unhideWhenUsed="0"/>
-    <w:lsdException w:name="Medium List 1 Accent 1" w:semiHidden="0" w:uiPriority="65" w:unhideWhenUsed="0"/>
-    <w:lsdException w:name="Revision" w:unhideWhenUsed="0"/>
-    <w:lsdException w:name="List Paragraph" w:semiHidden="0" w:uiPriority="34" w:unhideWhenUsed="0" w:qFormat="1"/>
-    <w:lsdException w:name="Quote" w:semiHidden="0" w:uiPriority="29" w:unhideWhenUsed="0" w:qFormat="1"/>
-    <w:lsdException w:name="Intense Quote" w:semiHidden="0" w:uiPriority="30" w:unhideWhenUsed="0" w:qFormat="1"/>
-    <w:lsdException w:name="Medium List 2 Accent 1" w:semiHidden="0" w:uiPriority="66" w:unhideWhenUsed="0"/>
-    <w:lsdException w:name="Medium Grid 1 Accent 1" w:semiHidden="0" w:uiPriority="67" w:unhideWhenUsed="0"/>
-    <w:lsdException w:name="Medium Grid 2 Accent 1" w:semiHidden="0" w:uiPriority="68" w:unhideWhenUsed="0"/>
-    <w:lsdException w:name="Medium Grid 3 Accent 1" w:semiHidden="0" w:uiPriority="69" w:unhideWhenUsed="0"/>
-    <w:lsdException w:name="Dark List Accent 1" w:semiHidden="0" w:uiPriority="70" w:unhideWhenUsed="0"/>
-    <w:lsdException w:name="Colorful Shading Accent 1" w:semiHidden="0" w:uiPriority="71" w:unhideWhenUsed="0"/>
-    <w:lsdException w:name="Colorful List Accent 1" w:semiHidden="0" w:uiPriority="72" w:unhideWhenUsed="0"/>
-    <w:lsdException w:name="Colorful Grid Accent 1" w:semiHidden="0" w:uiPriority="73" w:unhideWhenUsed="0"/>
-    <w:lsdException w:name="Light Shading Accent 2" w:semiHidden="0" w:uiPriority="60" w:unhideWhenUsed="0"/>
-    <w:lsdException w:name="Light List Accent 2" w:semiHidden="0" w:uiPriority="61" w:unhideWhenUsed="0"/>
-    <w:lsdException w:name="Light Grid Accent 2" w:semiHidden="0" w:uiPriority="62" w:unhideWhenUsed="0"/>
-    <w:lsdException w:name="Medium Shading 1 Accent 2" w:semiHidden="0" w:uiPriority="63" w:unhideWhenUsed="0"/>
-    <w:lsdException w:name="Medium Shading 2 Accent 2" w:semiHidden="0" w:uiPriority="64" w:unhideWhenUsed="0"/>
-    <w:lsdException w:name="Medium List 1 Accent 2" w:semiHidden="0" w:uiPriority="65" w:unhideWhenUsed="0"/>
-    <w:lsdException w:name="Medium List 2 Accent 2" w:semiHidden="0" w:uiPriority="66" w:unhideWhenUsed="0"/>
-    <w:lsdException w:name="Medium Grid 1 Accent 2" w:semiHidden="0" w:uiPriority="67" w:unhideWhenUsed="0"/>
-    <w:lsdException w:name="Medium Grid 2 Accent 2" w:semiHidden="0" w:uiPriority="68" w:unhideWhenUsed="0"/>
-    <w:lsdException w:name="Medium Grid 3 Accent 2" w:semiHidden="0" w:uiPriority="69" w:unhideWhenUsed="0"/>
-    <w:lsdException w:name="Dark List Accent 2" w:semiHidden="0" w:uiPriority="70" w:unhideWhenUsed="0"/>
-    <w:lsdException w:name="Colorful Shading Accent 2" w:semiHidden="0" w:uiPriority="71" w:unhideWhenUsed="0"/>
-    <w:lsdException w:name="Colorful List Accent 2" w:semiHidden="0" w:uiPriority="72" w:unhideWhenUsed="0"/>
-    <w:lsdException w:name="Colorful Grid Accent 2" w:semiHidden="0" w:uiPriority="73" w:unhideWhenUsed="0"/>
-    <w:lsdException w:name="Light Shading Accent 3" w:semiHidden="0" w:uiPriority="60" w:unhideWhenUsed="0"/>
-    <w:lsdException w:name="Light List Accent 3" w:semiHidden="0" w:uiPriority="61" w:unhideWhenUsed="0"/>
-    <w:lsdException w:name="Light Grid Accent 3" w:semiHidden="0" w:uiPriority="62" w:unhideWhenUsed="0"/>
-    <w:lsdException w:name="Medium Shading 1 Accent 3" w:semiHidden="0" w:uiPriority="63" w:unhideWhenUsed="0"/>
-    <w:lsdException w:name="Medium Shading 2 Accent 3" w:semiHidden="0" w:uiPriority="64" w:unhideWhenUsed="0"/>
-    <w:lsdException w:name="Medium List 1 Accent 3" w:semiHidden="0" w:uiPriority="65" w:unhideWhenUsed="0"/>
-    <w:lsdException w:name="Medium List 2 Accent 3" w:semiHidden="0" w:uiPriority="66" w:unhideWhenUsed="0"/>
-    <w:lsdException w:name="Medium Grid 1 Accent 3" w:semiHidden="0" w:uiPriority="67" w:unhideWhenUsed="0"/>
-    <w:lsdException w:name="Medium Grid 2 Accent 3" w:semiHidden="0" w:uiPriority="68" w:unhideWhenUsed="0"/>
-    <w:lsdException w:name="Medium Grid 3 Accent 3" w:semiHidden="0" w:uiPriority="69" w:unhideWhenUsed="0"/>
-    <w:lsdException w:name="Dark List Accent 3" w:semiHidden="0" w:uiPriority="70" w:unhideWhenUsed="0"/>
-    <w:lsdException w:name="Colorful Shading Accent 3" w:semiHidden="0" w:uiPriority="71" w:unhideWhenUsed="0"/>
-    <w:lsdException w:name="Colorful List Accent 3" w:semiHidden="0" w:uiPriority="72" w:unhideWhenUsed="0"/>
-    <w:lsdException w:name="Colorful Grid Accent 3" w:semiHidden="0" w:uiPriority="73" w:unhideWhenUsed="0"/>
-    <w:lsdException w:name="Light Shading Accent 4" w:semiHidden="0" w:uiPriority="60" w:unhideWhenUsed="0"/>
-    <w:lsdException w:name="Light List Accent 4" w:semiHidden="0" w:uiPriority="61" w:unhideWhenUsed="0"/>
-    <w:lsdException w:name="Light Grid Accent 4" w:semiHidden="0" w:uiPriority="62" w:unhideWhenUsed="0"/>
-    <w:lsdException w:name="Medium Shading 1 Accent 4" w:semiHidden="0" w:uiPriority="63" w:unhideWhenUsed="0"/>
-    <w:lsdException w:name="Medium Shading 2 Accent 4" w:semiHidden="0" w:uiPriority="64" w:unhideWhenUsed="0"/>
-    <w:lsdException w:name="Medium List 1 Accent 4" w:semiHidden="0" w:uiPriority="65" w:unhideWhenUsed="0"/>
-    <w:lsdException w:name="Medium List 2 Accent 4" w:semiHidden="0" w:uiPriority="66" w:unhideWhenUsed="0"/>
-    <w:lsdException w:name="Medium Grid 1 Accent 4" w:semiHidden="0" w:uiPriority="67" w:unhideWhenUsed="0"/>
-    <w:lsdException w:name="Medium Grid 2 Accent 4" w:semiHidden="0" w:uiPriority="68" w:unhideWhenUsed="0"/>
-    <w:lsdException w:name="Medium Grid 3 Accent 4" w:semiHidden="0" w:uiPriority="69" w:unhideWhenUsed="0"/>
-    <w:lsdException w:name="Dark List Accent 4" w:semiHidden="0" w:uiPriority="70" w:unhideWhenUsed="0"/>
-    <w:lsdException w:name="Colorful Shading Accent 4" w:semiHidden="0" w:uiPriority="71" w:unhideWhenUsed="0"/>
-    <w:lsdException w:name="Colorful List Accent 4" w:semiHidden="0" w:uiPriority="72" w:unhideWhenUsed="0"/>
-    <w:lsdException w:name="Colorful Grid Accent 4" w:semiHidden="0" w:uiPriority="73" w:unhideWhenUsed="0"/>
-    <w:lsdException w:name="Light Shading Accent 5" w:semiHidden="0" w:uiPriority="60" w:unhideWhenUsed="0"/>
-    <w:lsdException w:name="Light List Accent 5" w:semiHidden="0" w:uiPriority="61" w:unhideWhenUsed="0"/>
-    <w:lsdException w:name="Light Grid Accent 5" w:semiHidden="0" w:uiPriority="62" w:unhideWhenUsed="0"/>
-    <w:lsdException w:name="Medium Shading 1 Accent 5" w:semiHidden="0" w:uiPriority="63" w:unhideWhenUsed="0"/>
-    <w:lsdException w:name="Medium Shading 2 Accent 5" w:semiHidden="0" w:uiPriority="64" w:unhideWhenUsed="0"/>
-    <w:lsdException w:name="Medium List 1 Accent 5" w:semiHidden="0" w:uiPriority="65" w:unhideWhenUsed="0"/>
-    <w:lsdException w:name="Medium List 2 Accent 5" w:semiHidden="0" w:uiPriority="66" w:unhideWhenUsed="0"/>
-    <w:lsdException w:name="Medium Grid 1 Accent 5" w:semiHidden="0" w:uiPriority="67" w:unhideWhenUsed="0"/>
-    <w:lsdException w:name="Medium Grid 2 Accent 5" w:semiHidden="0" w:uiPriority="68" w:unhideWhenUsed="0"/>
-    <w:lsdException w:name="Medium Grid 3 Accent 5" w:semiHidden="0" w:uiPriority="69" w:unhideWhenUsed="0"/>
-    <w:lsdException w:name="Dark List Accent 5" w:semiHidden="0" w:uiPriority="70" w:unhideWhenUsed="0"/>
-    <w:lsdException w:name="Colorful Shading Accent 5" w:semiHidden="0" w:uiPriority="71" w:unhideWhenUsed="0"/>
-    <w:lsdException w:name="Colorful List Accent 5" w:semiHidden="0" w:uiPriority="72" w:unhideWhenUsed="0"/>
-    <w:lsdException w:name="Colorful Grid Accent 5" w:semiHidden="0" w:uiPriority="73" w:unhideWhenUsed="0"/>
-    <w:lsdException w:name="Light Shading Accent 6" w:semiHidden="0" w:uiPriority="60" w:unhideWhenUsed="0"/>
-    <w:lsdException w:name="Light List Accent 6" w:semiHidden="0" w:uiPriority="61" w:unhideWhenUsed="0"/>
-    <w:lsdException w:name="Light Grid Accent 6" w:semiHidden="0" w:uiPriority="62" w:unhideWhenUsed="0"/>
-    <w:lsdException w:name="Medium Shading 1 Accent 6" w:semiHidden="0" w:uiPriority="63" w:unhideWhenUsed="0"/>
-    <w:lsdException w:name="Medium Shading 2 Accent 6" w:semiHidden="0" w:uiPriority="64" w:unhideWhenUsed="0"/>
-    <w:lsdException w:name="Medium List 1 Accent 6" w:semiHidden="0" w:uiPriority="65" w:unhideWhenUsed="0"/>
-    <w:lsdException w:name="Medium List 2 Accent 6" w:semiHidden="0" w:uiPriority="66" w:unhideWhenUsed="0"/>
-    <w:lsdException w:name="Medium Grid 1 Accent 6" w:semiHidden="0" w:uiPriority="67" w:unhideWhenUsed="0"/>
-    <w:lsdException w:name="Medium Grid 2 Accent 6" w:semiHidden="0" w:uiPriority="68" w:unhideWhenUsed="0"/>
-    <w:lsdException w:name="Medium Grid 3 Accent 6" w:semiHidden="0" w:uiPriority="69" w:unhideWhenUsed="0"/>
-    <w:lsdException w:name="Dark List Accent 6" w:semiHidden="0" w:uiPriority="70" w:unhideWhenUsed="0"/>
-    <w:lsdException w:name="Colorful Shading Accent 6" w:semiHidden="0" w:uiPriority="71" w:unhideWhenUsed="0"/>
-    <w:lsdException w:name="Colorful List Accent 6" w:semiHidden="0" w:uiPriority="72" w:unhideWhenUsed="0"/>
-    <w:lsdException w:name="Colorful Grid Accent 6" w:semiHidden="0" w:uiPriority="73" w:unhideWhenUsed="0"/>
-    <w:lsdException w:name="Subtle Emphasis" w:semiHidden="0" w:uiPriority="19" w:unhideWhenUsed="0" w:qFormat="1"/>
-    <w:lsdException w:name="Intense Emphasis" w:semiHidden="0" w:uiPriority="21" w:unhideWhenUsed="0" w:qFormat="1"/>
-    <w:lsdException w:name="Subtle Reference" w:semiHidden="0" w:uiPriority="31" w:unhideWhenUsed="0" w:qFormat="1"/>
-    <w:lsdException w:name="Intense Reference" w:semiHidden="0" w:uiPriority="32" w:unhideWhenUsed="0" w:qFormat="1"/>
-    <w:lsdException w:name="Book Title" w:semiHidden="0" w:uiPriority="33" w:unhideWhenUsed="0" w:qFormat="1"/>
-    <w:lsdException w:name="Bibliography" w:uiPriority="37"/>
-    <w:lsdException w:name="TOC Heading" w:uiPriority="39" w:qFormat="1"/>
-  </w:latentStyles>
-  <w:style w:type="paragraph" w:default="1" w:styleId="Normal">
-    <w:name w:val="Normal"/>
-    <w:qFormat/>
-  </w:style>
-  <w:style w:type="paragraph" w:styleId="Ttulo1">
-    <w:name w:val="heading 1"/>
-    <w:basedOn w:val="Normal"/>
-    <w:next w:val="Normal"/>
-    <w:link w:val="Ttulo1Char"/>
-    <w:uiPriority w:val="9"/>
-    <w:qFormat/>
-    <w:rsid w:val="00140D25"/>
-    <w:pPr>
-      <w:keepNext/>
-      <w:keepLines/>
-      <w:spacing w:before="360" w:after="80"/>
-      <w:outlineLvl w:val="0"/>
-    </w:pPr>
-    <w:rPr>
-      <w:rFonts w:asciiTheme="majorHAnsi" w:eastAsiaTheme="majorEastAsia" w:hAnsiTheme="majorHAnsi" w:cstheme="majorBidi"/>
-      <w:color w:val="0F4761" w:themeColor="accent1" w:themeShade="BF"/>
-      <w:sz w:val="40"/>
-      <w:szCs w:val="40"/>
-    </w:rPr>
-  </w:style>
-  <w:style w:type="paragraph" w:styleId="Ttulo2">
-    <w:name w:val="heading 2"/>
-    <w:basedOn w:val="Normal"/>
-    <w:next w:val="Normal"/>
-    <w:link w:val="Ttulo2Char"/>
-    <w:uiPriority w:val="9"/>
-    <w:semiHidden/>
-    <w:unhideWhenUsed/>
-    <w:qFormat/>
-    <w:rsid w:val="00140D25"/>
-    <w:pPr>
-      <w:keepNext/>
-      <w:keepLines/>
-      <w:spacing w:before="160" w:after="80"/>
-      <w:outlineLvl w:val="1"/>
-    </w:pPr>
-    <w:rPr>
-      <w:rFonts w:asciiTheme="majorHAnsi" w:eastAsiaTheme="majorEastAsia" w:hAnsiTheme="majorHAnsi" w:cstheme="majorBidi"/>
-      <w:color w:val="0F4761" w:themeColor="accent1" w:themeShade="BF"/>
-      <w:sz w:val="32"/>
-      <w:szCs w:val="32"/>
-    </w:rPr>
-  </w:style>
-  <w:style w:type="paragraph" w:styleId="Ttulo3">
-    <w:name w:val="heading 3"/>
-    <w:basedOn w:val="Normal"/>
-    <w:next w:val="Normal"/>
-    <w:link w:val="Ttulo3Char"/>
-    <w:uiPriority w:val="9"/>
-    <w:semiHidden/>
-    <w:unhideWhenUsed/>
-    <w:qFormat/>
-    <w:rsid w:val="00140D25"/>
-    <w:pPr>
-      <w:keepNext/>
-      <w:keepLines/>
-      <w:spacing w:before="160" w:after="80"/>
-      <w:outlineLvl w:val="2"/>
-    </w:pPr>
-    <w:rPr>
-      <w:rFonts w:eastAsiaTheme="majorEastAsia" w:cstheme="majorBidi"/>
-      <w:color w:val="0F4761" w:themeColor="accent1" w:themeShade="BF"/>
-      <w:sz w:val="28"/>
-      <w:szCs w:val="28"/>
-    </w:rPr>
-  </w:style>
-  <w:style w:type="paragraph" w:styleId="Ttulo4">
-    <w:name w:val="heading 4"/>
-    <w:basedOn w:val="Normal"/>
-    <w:next w:val="Normal"/>
-    <w:link w:val="Ttulo4Char"/>
-    <w:uiPriority w:val="9"/>
-    <w:semiHidden/>
-    <w:unhideWhenUsed/>
-    <w:qFormat/>
-    <w:rsid w:val="00140D25"/>
-    <w:pPr>
-      <w:keepNext/>
-      <w:keepLines/>
-      <w:spacing w:before="80" w:after="40"/>
-      <w:outlineLvl w:val="3"/>
-    </w:pPr>
-    <w:rPr>
-      <w:rFonts w:eastAsiaTheme="majorEastAsia" w:cstheme="majorBidi"/>
-      <w:i/>
-      <w:iCs/>
-      <w:color w:val="0F4761" w:themeColor="accent1" w:themeShade="BF"/>
-    </w:rPr>
-  </w:style>
-  <w:style w:type="paragraph" w:styleId="Ttulo5">
-    <w:name w:val="heading 5"/>
-    <w:basedOn w:val="Normal"/>
-    <w:next w:val="Normal"/>
-    <w:link w:val="Ttulo5Char"/>
-    <w:uiPriority w:val="9"/>
-    <w:semiHidden/>
-    <w:unhideWhenUsed/>
-    <w:qFormat/>
-    <w:rsid w:val="00140D25"/>
-    <w:pPr>
-      <w:keepNext/>
-      <w:keepLines/>
-      <w:spacing w:before="80" w:after="40"/>
-      <w:outlineLvl w:val="4"/>
-    </w:pPr>
-    <w:rPr>
-      <w:rFonts w:eastAsiaTheme="majorEastAsia" w:cstheme="majorBidi"/>
-      <w:color w:val="0F4761" w:themeColor="accent1" w:themeShade="BF"/>
-    </w:rPr>
-  </w:style>
-  <w:style w:type="paragraph" w:styleId="Ttulo6">
-    <w:name w:val="heading 6"/>
-    <w:basedOn w:val="Normal"/>
-    <w:next w:val="Normal"/>
-    <w:link w:val="Ttulo6Char"/>
-    <w:uiPriority w:val="9"/>
-    <w:semiHidden/>
-    <w:unhideWhenUsed/>
-    <w:qFormat/>
-    <w:rsid w:val="00140D25"/>
-    <w:pPr>
-      <w:keepNext/>
-      <w:keepLines/>
-      <w:spacing w:before="40" w:after="0"/>
-      <w:outlineLvl w:val="5"/>
-    </w:pPr>
-    <w:rPr>
-      <w:rFonts w:eastAsiaTheme="majorEastAsia" w:cstheme="majorBidi"/>
-      <w:i/>
-      <w:iCs/>
-      <w:color w:val="595959" w:themeColor="text1" w:themeTint="A6"/>
-    </w:rPr>
-  </w:style>
-  <w:style w:type="paragraph" w:styleId="Ttulo7">
-    <w:name w:val="heading 7"/>
-    <w:basedOn w:val="Normal"/>
-    <w:next w:val="Normal"/>
-    <w:link w:val="Ttulo7Char"/>
-    <w:uiPriority w:val="9"/>
-    <w:semiHidden/>
-    <w:unhideWhenUsed/>
-    <w:qFormat/>
-    <w:rsid w:val="00140D25"/>
-    <w:pPr>
-      <w:keepNext/>
-      <w:keepLines/>
-      <w:spacing w:before="40" w:after="0"/>
-      <w:outlineLvl w:val="6"/>
-    </w:pPr>
-    <w:rPr>
-      <w:rFonts w:eastAsiaTheme="majorEastAsia" w:cstheme="majorBidi"/>
-      <w:color w:val="595959" w:themeColor="text1" w:themeTint="A6"/>
-    </w:rPr>
-  </w:style>
-  <w:style w:type="paragraph" w:styleId="Ttulo8">
-    <w:name w:val="heading 8"/>
-    <w:basedOn w:val="Normal"/>
-    <w:next w:val="Normal"/>
-    <w:link w:val="Ttulo8Char"/>
-    <w:uiPriority w:val="9"/>
-    <w:semiHidden/>
-    <w:unhideWhenUsed/>
-    <w:qFormat/>
-    <w:rsid w:val="00140D25"/>
-    <w:pPr>
-      <w:keepNext/>
-      <w:keepLines/>
-      <w:spacing w:after="0"/>
-      <w:outlineLvl w:val="7"/>
-    </w:pPr>
-    <w:rPr>
-      <w:rFonts w:eastAsiaTheme="majorEastAsia" w:cstheme="majorBidi"/>
-      <w:i/>
-      <w:iCs/>
-      <w:color w:val="272727" w:themeColor="text1" w:themeTint="D8"/>
-    </w:rPr>
-  </w:style>
-  <w:style w:type="paragraph" w:styleId="Ttulo9">
-    <w:name w:val="heading 9"/>
-    <w:basedOn w:val="Normal"/>
-    <w:next w:val="Normal"/>
-    <w:link w:val="Ttulo9Char"/>
-    <w:uiPriority w:val="9"/>
-    <w:semiHidden/>
-    <w:unhideWhenUsed/>
-    <w:qFormat/>
-    <w:rsid w:val="00140D25"/>
-    <w:pPr>
-      <w:keepNext/>
-      <w:keepLines/>
-      <w:spacing w:after="0"/>
-      <w:outlineLvl w:val="8"/>
-    </w:pPr>
-    <w:rPr>
-      <w:rFonts w:eastAsiaTheme="majorEastAsia" w:cstheme="majorBidi"/>
-      <w:color w:val="272727" w:themeColor="text1" w:themeTint="D8"/>
-    </w:rPr>
-  </w:style>
-  <w:style w:type="character" w:default="1" w:styleId="Fontepargpadro">
-    <w:name w:val="Default Paragraph Font"/>
-    <w:uiPriority w:val="1"/>
-    <w:semiHidden/>
-    <w:unhideWhenUsed/>
-  </w:style>
-  <w:style w:type="table" w:default="1" w:styleId="Tabelanormal">
-    <w:name w:val="Normal Table"/>
-    <w:uiPriority w:val="99"/>
-    <w:semiHidden/>
-    <w:unhideWhenUsed/>
-    <w:tblPr>
-      <w:tblInd w:w="0" w:type="dxa"/>
-      <w:tblCellMar>
-        <w:top w:w="0" w:type="dxa"/>
-        <w:left w:w="108" w:type="dxa"/>
-        <w:bottom w:w="0" w:type="dxa"/>
-        <w:right w:w="108" w:type="dxa"/>
-      </w:tblCellMar>
-    </w:tblPr>
-  </w:style>
-  <w:style w:type="numbering" w:default="1" w:styleId="Semlista">
-    <w:name w:val="No List"/>
-    <w:uiPriority w:val="99"/>
-    <w:semiHidden/>
-    <w:unhideWhenUsed/>
-  </w:style>
-  <w:style w:type="character" w:customStyle="1" w:styleId="Ttulo1Char">
-    <w:name w:val="Título 1 Char"/>
-    <w:basedOn w:val="Fontepargpadro"/>
-    <w:link w:val="Ttulo1"/>
-    <w:uiPriority w:val="9"/>
-    <w:rsid w:val="00140D25"/>
-    <w:rPr>
-      <w:rFonts w:asciiTheme="majorHAnsi" w:eastAsiaTheme="majorEastAsia" w:hAnsiTheme="majorHAnsi" w:cstheme="majorBidi"/>
-      <w:color w:val="0F4761" w:themeColor="accent1" w:themeShade="BF"/>
-      <w:sz w:val="40"/>
-      <w:szCs w:val="40"/>
-    </w:rPr>
-  </w:style>
-  <w:style w:type="character" w:customStyle="1" w:styleId="Ttulo2Char">
-    <w:name w:val="Título 2 Char"/>
-    <w:basedOn w:val="Fontepargpadro"/>
-    <w:link w:val="Ttulo2"/>
-    <w:uiPriority w:val="9"/>
-    <w:semiHidden/>
-    <w:rsid w:val="00140D25"/>
-    <w:rPr>
-      <w:rFonts w:asciiTheme="majorHAnsi" w:eastAsiaTheme="majorEastAsia" w:hAnsiTheme="majorHAnsi" w:cstheme="majorBidi"/>
-      <w:color w:val="0F4761" w:themeColor="accent1" w:themeShade="BF"/>
-      <w:sz w:val="32"/>
-      <w:szCs w:val="32"/>
-    </w:rPr>
-  </w:style>
-  <w:style w:type="character" w:customStyle="1" w:styleId="Ttulo3Char">
-    <w:name w:val="Título 3 Char"/>
-    <w:basedOn w:val="Fontepargpadro"/>
-    <w:link w:val="Ttulo3"/>
-    <w:uiPriority w:val="9"/>
-    <w:semiHidden/>
-    <w:rsid w:val="00140D25"/>
-    <w:rPr>
-      <w:rFonts w:eastAsiaTheme="majorEastAsia" w:cstheme="majorBidi"/>
-      <w:color w:val="0F4761" w:themeColor="accent1" w:themeShade="BF"/>
-      <w:sz w:val="28"/>
-      <w:szCs w:val="28"/>
-    </w:rPr>
-  </w:style>
-  <w:style w:type="character" w:customStyle="1" w:styleId="Ttulo4Char">
-    <w:name w:val="Título 4 Char"/>
-    <w:basedOn w:val="Fontepargpadro"/>
-    <w:link w:val="Ttulo4"/>
-    <w:uiPriority w:val="9"/>
-    <w:semiHidden/>
-    <w:rsid w:val="00140D25"/>
-    <w:rPr>
-      <w:rFonts w:eastAsiaTheme="majorEastAsia" w:cstheme="majorBidi"/>
-      <w:i/>
-      <w:iCs/>
-      <w:color w:val="0F4761" w:themeColor="accent1" w:themeShade="BF"/>
-    </w:rPr>
-  </w:style>
-  <w:style w:type="character" w:customStyle="1" w:styleId="Ttulo5Char">
-    <w:name w:val="Título 5 Char"/>
-    <w:basedOn w:val="Fontepargpadro"/>
-    <w:link w:val="Ttulo5"/>
-    <w:uiPriority w:val="9"/>
-    <w:semiHidden/>
-    <w:rsid w:val="00140D25"/>
-    <w:rPr>
-      <w:rFonts w:eastAsiaTheme="majorEastAsia" w:cstheme="majorBidi"/>
-      <w:color w:val="0F4761" w:themeColor="accent1" w:themeShade="BF"/>
-    </w:rPr>
-  </w:style>
-  <w:style w:type="character" w:customStyle="1" w:styleId="Ttulo6Char">
-    <w:name w:val="Título 6 Char"/>
-    <w:basedOn w:val="Fontepargpadro"/>
-    <w:link w:val="Ttulo6"/>
-    <w:uiPriority w:val="9"/>
-    <w:semiHidden/>
-    <w:rsid w:val="00140D25"/>
-    <w:rPr>
-      <w:rFonts w:eastAsiaTheme="majorEastAsia" w:cstheme="majorBidi"/>
-      <w:i/>
-      <w:iCs/>
-      <w:color w:val="595959" w:themeColor="text1" w:themeTint="A6"/>
-    </w:rPr>
-  </w:style>
-  <w:style w:type="character" w:customStyle="1" w:styleId="Ttulo7Char">
-    <w:name w:val="Título 7 Char"/>
-    <w:basedOn w:val="Fontepargpadro"/>
-    <w:link w:val="Ttulo7"/>
-    <w:uiPriority w:val="9"/>
-    <w:semiHidden/>
-    <w:rsid w:val="00140D25"/>
-    <w:rPr>
-      <w:rFonts w:eastAsiaTheme="majorEastAsia" w:cstheme="majorBidi"/>
-      <w:color w:val="595959" w:themeColor="text1" w:themeTint="A6"/>
-    </w:rPr>
-  </w:style>
-  <w:style w:type="character" w:customStyle="1" w:styleId="Ttulo8Char">
-    <w:name w:val="Título 8 Char"/>
-    <w:basedOn w:val="Fontepargpadro"/>
-    <w:link w:val="Ttulo8"/>
-    <w:uiPriority w:val="9"/>
-    <w:semiHidden/>
-    <w:rsid w:val="00140D25"/>
-    <w:rPr>
-      <w:rFonts w:eastAsiaTheme="majorEastAsia" w:cstheme="majorBidi"/>
-      <w:i/>
-      <w:iCs/>
-      <w:color w:val="272727" w:themeColor="text1" w:themeTint="D8"/>
-    </w:rPr>
-  </w:style>
-  <w:style w:type="character" w:customStyle="1" w:styleId="Ttulo9Char">
-    <w:name w:val="Título 9 Char"/>
-    <w:basedOn w:val="Fontepargpadro"/>
-    <w:link w:val="Ttulo9"/>
-    <w:uiPriority w:val="9"/>
-    <w:semiHidden/>
-    <w:rsid w:val="00140D25"/>
-    <w:rPr>
-      <w:rFonts w:eastAsiaTheme="majorEastAsia" w:cstheme="majorBidi"/>
-      <w:color w:val="272727" w:themeColor="text1" w:themeTint="D8"/>
-    </w:rPr>
-  </w:style>
-  <w:style w:type="paragraph" w:styleId="Ttulo">
-    <w:name w:val="Title"/>
-    <w:basedOn w:val="Normal"/>
-    <w:next w:val="Normal"/>
-    <w:link w:val="TtuloChar"/>
-    <w:uiPriority w:val="10"/>
-    <w:qFormat/>
-    <w:rsid w:val="00140D25"/>
-    <w:pPr>
-      <w:spacing w:after="80" w:line="240" w:lineRule="auto"/>
-      <w:contextualSpacing/>
-    </w:pPr>
-    <w:rPr>
-      <w:rFonts w:asciiTheme="majorHAnsi" w:eastAsiaTheme="majorEastAsia" w:hAnsiTheme="majorHAnsi" w:cstheme="majorBidi"/>
-      <w:spacing w:val="-10"/>
-      <w:kern w:val="28"/>
-      <w:sz w:val="56"/>
-      <w:szCs w:val="56"/>
-    </w:rPr>
-  </w:style>
-  <w:style w:type="character" w:customStyle="1" w:styleId="TtuloChar">
-    <w:name w:val="Título Char"/>
-    <w:basedOn w:val="Fontepargpadro"/>
-    <w:link w:val="Ttulo"/>
-    <w:uiPriority w:val="10"/>
-    <w:rsid w:val="00140D25"/>
-    <w:rPr>
-      <w:rFonts w:asciiTheme="majorHAnsi" w:eastAsiaTheme="majorEastAsia" w:hAnsiTheme="majorHAnsi" w:cstheme="majorBidi"/>
-      <w:spacing w:val="-10"/>
-      <w:kern w:val="28"/>
-      <w:sz w:val="56"/>
-      <w:szCs w:val="56"/>
-    </w:rPr>
-  </w:style>
-  <w:style w:type="paragraph" w:styleId="Subttulo">
-    <w:name w:val="Subtitle"/>
-    <w:basedOn w:val="Normal"/>
-    <w:next w:val="Normal"/>
-    <w:link w:val="SubttuloChar"/>
-    <w:uiPriority w:val="11"/>
-    <w:qFormat/>
-    <w:rsid w:val="00140D25"/>
-    <w:pPr>
-      <w:numPr>
-        <w:ilvl w:val="1"/>
-      </w:numPr>
-    </w:pPr>
-    <w:rPr>
-      <w:rFonts w:eastAsiaTheme="majorEastAsia" w:cstheme="majorBidi"/>
-      <w:color w:val="595959" w:themeColor="text1" w:themeTint="A6"/>
-      <w:spacing w:val="15"/>
-      <w:sz w:val="28"/>
-      <w:szCs w:val="28"/>
-    </w:rPr>
-  </w:style>
-  <w:style w:type="character" w:customStyle="1" w:styleId="SubttuloChar">
-    <w:name w:val="Subtítulo Char"/>
-    <w:basedOn w:val="Fontepargpadro"/>
-    <w:link w:val="Subttulo"/>
-    <w:uiPriority w:val="11"/>
-    <w:rsid w:val="00140D25"/>
-    <w:rPr>
-      <w:rFonts w:eastAsiaTheme="majorEastAsia" w:cstheme="majorBidi"/>
-      <w:color w:val="595959" w:themeColor="text1" w:themeTint="A6"/>
-      <w:spacing w:val="15"/>
-      <w:sz w:val="28"/>
-      <w:szCs w:val="28"/>
-    </w:rPr>
-  </w:style>
-  <w:style w:type="paragraph" w:styleId="Citao">
-    <w:name w:val="Quote"/>
-    <w:basedOn w:val="Normal"/>
-    <w:next w:val="Normal"/>
-    <w:link w:val="CitaoChar"/>
-    <w:uiPriority w:val="29"/>
-    <w:qFormat/>
-    <w:rsid w:val="00140D25"/>
-    <w:pPr>
-      <w:spacing w:before="160"/>
-      <w:jc w:val="center"/>
-    </w:pPr>
-    <w:rPr>
-      <w:i/>
-      <w:iCs/>
-      <w:color w:val="404040" w:themeColor="text1" w:themeTint="BF"/>
-    </w:rPr>
-  </w:style>
-  <w:style w:type="character" w:customStyle="1" w:styleId="CitaoChar">
-    <w:name w:val="Citação Char"/>
-    <w:basedOn w:val="Fontepargpadro"/>
-    <w:link w:val="Citao"/>
-    <w:uiPriority w:val="29"/>
-    <w:rsid w:val="00140D25"/>
-    <w:rPr>
-      <w:i/>
-      <w:iCs/>
-      <w:color w:val="404040" w:themeColor="text1" w:themeTint="BF"/>
-    </w:rPr>
-  </w:style>
-  <w:style w:type="paragraph" w:styleId="PargrafodaLista">
-    <w:name w:val="List Paragraph"/>
-    <w:basedOn w:val="Normal"/>
-    <w:uiPriority w:val="34"/>
-    <w:qFormat/>
-    <w:rsid w:val="00140D25"/>
-    <w:pPr>
-      <w:ind w:left="720"/>
-      <w:contextualSpacing/>
-    </w:pPr>
-  </w:style>
-  <w:style w:type="character" w:styleId="nfaseIntensa">
-    <w:name w:val="Intense Emphasis"/>
-    <w:basedOn w:val="Fontepargpadro"/>
-    <w:uiPriority w:val="21"/>
-    <w:qFormat/>
-    <w:rsid w:val="00140D25"/>
-    <w:rPr>
-      <w:i/>
-      <w:iCs/>
-      <w:color w:val="0F4761" w:themeColor="accent1" w:themeShade="BF"/>
-    </w:rPr>
-  </w:style>
-  <w:style w:type="paragraph" w:styleId="CitaoIntensa">
-    <w:name w:val="Intense Quote"/>
-    <w:basedOn w:val="Normal"/>
-    <w:next w:val="Normal"/>
-    <w:link w:val="CitaoIntensaChar"/>
-    <w:uiPriority w:val="30"/>
-    <w:qFormat/>
-    <w:rsid w:val="00140D25"/>
-    <w:pPr>
-      <w:pBdr>
-        <w:top w:val="single" w:sz="4" w:space="10" w:color="0F4761" w:themeColor="accent1" w:themeShade="BF"/>
-        <w:bottom w:val="single" w:sz="4" w:space="10" w:color="0F4761" w:themeColor="accent1" w:themeShade="BF"/>
-      </w:pBdr>
-      <w:spacing w:before="360" w:after="360"/>
-      <w:ind w:left="864" w:right="864"/>
-      <w:jc w:val="center"/>
-    </w:pPr>
-    <w:rPr>
-      <w:i/>
-      <w:iCs/>
-      <w:color w:val="0F4761" w:themeColor="accent1" w:themeShade="BF"/>
-    </w:rPr>
-  </w:style>
-  <w:style w:type="character" w:customStyle="1" w:styleId="CitaoIntensaChar">
-    <w:name w:val="Citação Intensa Char"/>
-    <w:basedOn w:val="Fontepargpadro"/>
-    <w:link w:val="CitaoIntensa"/>
-    <w:uiPriority w:val="30"/>
-    <w:rsid w:val="00140D25"/>
-    <w:rPr>
-      <w:i/>
-      <w:iCs/>
-      <w:color w:val="0F4761" w:themeColor="accent1" w:themeShade="BF"/>
-    </w:rPr>
-  </w:style>
-  <w:style w:type="character" w:styleId="RefernciaIntensa">
-    <w:name w:val="Intense Reference"/>
-    <w:basedOn w:val="Fontepargpadro"/>
-    <w:uiPriority w:val="32"/>
-    <w:qFormat/>
-    <w:rsid w:val="00140D25"/>
-    <w:rPr>
-      <w:b/>
-      <w:bCs/>
-      <w:smallCaps/>
-      <w:color w:val="0F4761" w:themeColor="accent1" w:themeShade="BF"/>
-      <w:spacing w:val="5"/>
-    </w:rPr>
-  </w:style>
-  <w:style w:type="paragraph" w:styleId="Cabealho">
-    <w:name w:val="header"/>
-    <w:basedOn w:val="Normal"/>
-    <w:link w:val="CabealhoChar"/>
-    <w:uiPriority w:val="99"/>
-    <w:unhideWhenUsed/>
-    <w:rsid w:val="00140D25"/>
-    <w:pPr>
-      <w:tabs>
-        <w:tab w:val="center" w:pos="4252"/>
-        <w:tab w:val="right" w:pos="8504"/>
-      </w:tabs>
-      <w:spacing w:after="0" w:line="240" w:lineRule="auto"/>
-    </w:pPr>
-  </w:style>
-  <w:style w:type="character" w:customStyle="1" w:styleId="CabealhoChar">
-    <w:name w:val="Cabeçalho Char"/>
-    <w:basedOn w:val="Fontepargpadro"/>
-    <w:link w:val="Cabealho"/>
-    <w:uiPriority w:val="99"/>
-    <w:rsid w:val="00140D25"/>
-  </w:style>
-  <w:style w:type="paragraph" w:styleId="Rodap">
-    <w:name w:val="footer"/>
-    <w:basedOn w:val="Normal"/>
-    <w:link w:val="RodapChar"/>
-    <w:uiPriority w:val="99"/>
-    <w:unhideWhenUsed/>
-    <w:rsid w:val="00140D25"/>
-    <w:pPr>
-      <w:tabs>
-        <w:tab w:val="center" w:pos="4252"/>
-        <w:tab w:val="right" w:pos="8504"/>
-      </w:tabs>
-      <w:spacing w:after="0" w:line="240" w:lineRule="auto"/>
-    </w:pPr>
-  </w:style>
-  <w:style w:type="character" w:customStyle="1" w:styleId="RodapChar">
-    <w:name w:val="Rodapé Char"/>
-    <w:basedOn w:val="Fontepargpadro"/>
-    <w:link w:val="Rodap"/>
-    <w:uiPriority w:val="99"/>
-    <w:rsid w:val="00140D25"/>
-  </w:style>
-  <w:style w:type="table" w:styleId="Tabelacomgrade">
-    <w:name w:val="Table Grid"/>
-    <w:basedOn w:val="Tabelanormal"/>
-    <w:uiPriority w:val="39"/>
-    <w:rsid w:val="00140D25"/>
-    <w:pPr>
-      <w:spacing w:after="0" w:line="240" w:lineRule="auto"/>
-    </w:pPr>
-    <w:tblPr>
-      <w:tblBorders>
-        <w:top w:val="single" w:sz="4" w:space="0" w:color="auto"/>
-        <w:left w:val="single" w:sz="4" w:space="0" w:color="auto"/>
-        <w:bottom w:val="single" w:sz="4" w:space="0" w:color="auto"/>
-        <w:right w:val="single" w:sz="4" w:space="0" w:color="auto"/>
-        <w:insideH w:val="single" w:sz="4" w:space="0" w:color="auto"/>
-        <w:insideV w:val="single" w:sz="4" w:space="0" w:color="auto"/>
-      </w:tblBorders>
-    </w:tblPr>
-  </w:style>
-  <w:style w:type="paragraph" w:styleId="Textodebalo">
-    <w:name w:val="Balloon Text"/>
-    <w:basedOn w:val="Normal"/>
-    <w:link w:val="TextodebaloChar"/>
-    <w:uiPriority w:val="99"/>
-    <w:semiHidden/>
-    <w:unhideWhenUsed/>
-    <w:rsid w:val="009A4BE8"/>
-    <w:pPr>
-      <w:spacing w:after="0" w:line="240" w:lineRule="auto"/>
-    </w:pPr>
-    <w:rPr>
-      <w:rFonts w:ascii="Tahoma" w:hAnsi="Tahoma" w:cs="Tahoma"/>
-      <w:sz w:val="16"/>
-      <w:szCs w:val="16"/>
-    </w:rPr>
-  </w:style>
-  <w:style w:type="character" w:customStyle="1" w:styleId="TextodebaloChar">
-    <w:name w:val="Texto de balão Char"/>
-    <w:basedOn w:val="Fontepargpadro"/>
-    <w:link w:val="Textodebalo"/>
-    <w:uiPriority w:val="99"/>
-    <w:semiHidden/>
-    <w:rsid w:val="009A4BE8"/>
-    <w:rPr>
-      <w:rFonts w:ascii="Tahoma" w:hAnsi="Tahoma" w:cs="Tahoma"/>
-      <w:sz w:val="16"/>
-      <w:szCs w:val="16"/>
-    </w:rPr>
-  </w:style>
-</w:styles>
-</file>
-
-<file path=word/stylesWithEffects.xml><?xml version="1.0" encoding="utf-8"?>
-<w:styles xmlns:wpc="http://schemas.microsoft.com/office/word/2010/wordprocessingCanvas" xmlns:mc="http://schemas.openxmlformats.org/markup-compatibility/2006" xmlns:o="urn:schemas-microsoft-com:office:office" xmlns:r="http://schemas.openxmlformats.org/officeDocument/2006/relationships" xmlns:m="http://schemas.openxmlformats.org/officeDocument/2006/math" xmlns:v="urn:schemas-microsoft-com:vml" xmlns:wp14="http://schemas.microsoft.com/office/word/2010/wordprocessingDrawing" xmlns:wp="http://schemas.openxmlformats.org/drawingml/2006/wordprocessingDrawing" xmlns:w10="urn:schemas-microsoft-com:office:word" xmlns:w="http://schemas.openxmlformats.org/wordprocessingml/2006/main" xmlns:w14="http://schemas.microsoft.com/office/word/2010/wordml" xmlns:wpg="http://schemas.microsoft.com/office/word/2010/wordprocessingGroup" xmlns:wpi="http://schemas.microsoft.com/office/word/2010/wordprocessingInk" xmlns:wne="http://schemas.microsoft.com/office/word/2006/wordml" xmlns:wps="http://schemas.microsoft.com/office/word/2010/wordprocessingShape" mc:Ignorable="w14 wp14">
-  <w:docDefaults>
-    <w:rPrDefault>
-      <w:rPr>
-        <w:rFonts w:asciiTheme="minorHAnsi" w:eastAsiaTheme="minorHAnsi" w:hAnsiTheme="minorHAnsi" w:cstheme="minorBidi"/>
-        <w:kern w:val="2"/>
-        <w:sz w:val="22"/>
-        <w:szCs w:val="22"/>
-        <w:lang w:val="pt-BR" w:eastAsia="en-US" w:bidi="ar-SA"/>
-        <w14:ligatures w14:val="standardContextual"/>
-      </w:rPr>
-    </w:rPrDefault>
-    <w:pPrDefault>
-      <w:pPr>
-        <w:spacing w:after="160" w:line="259" w:lineRule="auto"/>
-      </w:pPr>
-    </w:pPrDefault>
-  </w:docDefaults>
-  <w:latentStyles w:defLockedState="0" w:defUIPriority="99" w:defSemiHidden="1" w:defUnhideWhenUsed="1" w:defQFormat="0" w:count="267">
-    <w:lsdException w:name="Normal" w:semiHidden="0" w:uiPriority="0" w:unhideWhenUsed="0" w:qFormat="1"/>
-    <w:lsdException w:name="heading 1" w:semiHidden="0" w:uiPriority="9" w:unhideWhenUsed="0" w:qFormat="1"/>
-    <w:lsdException w:name="heading 2" w:uiPriority="9" w:qFormat="1"/>
-    <w:lsdException w:name="heading 3" w:uiPriority="9" w:qFormat="1"/>
-    <w:lsdException w:name="heading 4" w:uiPriority="9" w:qFormat="1"/>
-    <w:lsdException w:name="heading 5" w:uiPriority="9" w:qFormat="1"/>
-    <w:lsdException w:name="heading 6" w:uiPriority="9" w:qFormat="1"/>
-    <w:lsdException w:name="heading 7" w:uiPriority="9" w:qFormat="1"/>
-    <w:lsdException w:name="heading 8" w:uiPriority="9" w:qFormat="1"/>
-    <w:lsdException w:name="heading 9" w:uiPriority="9" w:qFormat="1"/>
-    <w:lsdException w:name="toc 1" w:uiPriority="39"/>
-    <w:lsdException w:name="toc 2" w:uiPriority="39"/>
-    <w:lsdException w:name="toc 3" w:uiPriority="39"/>
-    <w:lsdException w:name="toc 4" w:uiPriority="39"/>
-    <w:lsdException w:name="toc 5" w:uiPriority="39"/>
-    <w:lsdException w:name="toc 6" w:uiPriority="39"/>
-    <w:lsdException w:name="toc 7" w:uiPriority="39"/>
-    <w:lsdException w:name="toc 8" w:uiPriority="39"/>
-    <w:lsdException w:name="toc 9" w:uiPriority="39"/>
-    <w:lsdException w:name="caption" w:uiPriority="35" w:qFormat="1"/>
-    <w:lsdException w:name="Title" w:semiHidden="0" w:uiPriority="10" w:unhideWhenUsed="0" w:qFormat="1"/>
-    <w:lsdException w:name="Default Paragraph Font" w:uiPriority="1"/>
-    <w:lsdException w:name="Subtitle" w:semiHidden="0" w:uiPriority="11" w:unhideWhenUsed="0" w:qFormat="1"/>
-    <w:lsdException w:name="Strong" w:semiHidden="0" w:uiPriority="22" w:unhideWhenUsed="0" w:qFormat="1"/>
-    <w:lsdException w:name="Emphasis" w:semiHidden="0" w:uiPriority="20" w:unhideWhenUsed="0" w:qFormat="1"/>
-    <w:lsdException w:name="Table Grid" w:semiHidden="0" w:uiPriority="39" w:unhideWhenUsed="0"/>
-    <w:lsdException w:name="Placeholder Text" w:unhideWhenUsed="0"/>
-    <w:lsdException w:name="No Spacing" w:semiHidden="0" w:uiPriority="1" w:unhideWhenUsed="0" w:qFormat="1"/>
-    <w:lsdException w:name="Light Shading" w:semiHidden="0" w:uiPriority="60" w:unhideWhenUsed="0"/>
-    <w:lsdException w:name="Light List" w:semiHidden="0" w:uiPriority="61" w:unhideWhenUsed="0"/>
-    <w:lsdException w:name="Light Grid" w:semiHidden="0" w:uiPriority="62" w:unhideWhenUsed="0"/>
-    <w:lsdException w:name="Medium Shading 1" w:semiHidden="0" w:uiPriority="63" w:unhideWhenUsed="0"/>
-    <w:lsdException w:name="Medium Shading 2" w:semiHidden="0" w:uiPriority="64" w:unhideWhenUsed="0"/>
-    <w:lsdException w:name="Medium List 1" w:semiHidden="0" w:uiPriority="65" w:unhideWhenUsed="0"/>
-    <w:lsdException w:name="Medium List 2" w:semiHidden="0" w:uiPriority="66" w:unhideWhenUsed="0"/>
-    <w:lsdException w:name="Medium Grid 1" w:semiHidden="0" w:uiPriority="67" w:unhideWhenUsed="0"/>
-    <w:lsdException w:name="Medium Grid 2" w:semiHidden="0" w:uiPriority="68" w:unhideWhenUsed="0"/>
-    <w:lsdException w:name="Medium Grid 3" w:semiHidden="0" w:uiPriority="69" w:unhideWhenUsed="0"/>
-    <w:lsdException w:name="Dark List" w:semiHidden="0" w:uiPriority="70" w:unhideWhenUsed="0"/>
-    <w:lsdException w:name="Colorful Shading" w:semiHidden="0" w:uiPriority="71" w:unhideWhenUsed="0"/>
-    <w:lsdException w:name="Colorful List" w:semiHidden="0" w:uiPriority="72" w:unhideWhenUsed="0"/>
-    <w:lsdException w:name="Colorful Grid" w:semiHidden="0" w:uiPriority="73" w:unhideWhenUsed="0"/>
-    <w:lsdException w:name="Light Shading Accent 1" w:semiHidden="0" w:uiPriority="60" w:unhideWhenUsed="0"/>
-    <w:lsdException w:name="Light List Accent 1" w:semiHidden="0" w:uiPriority="61" w:unhideWhenUsed="0"/>
-    <w:lsdException w:name="Light Grid Accent 1" w:semiHidden="0" w:uiPriority="62" w:unhideWhenUsed="0"/>
-    <w:lsdException w:name="Medium Shading 1 Accent 1" w:semiHidden="0" w:uiPriority="63" w:unhideWhenUsed="0"/>
-    <w:lsdException w:name="Medium Shading 2 Accent 1" w:semiHidden="0" w:uiPriority="64" w:unhideWhenUsed="0"/>
-    <w:lsdException w:name="Medium List 1 Accent 1" w:semiHidden="0" w:uiPriority="65" w:unhideWhenUsed="0"/>
-    <w:lsdException w:name="Revision" w:unhideWhenUsed="0"/>
-    <w:lsdException w:name="List Paragraph" w:semiHidden="0" w:uiPriority="34" w:unhideWhenUsed="0" w:qFormat="1"/>
-    <w:lsdException w:name="Quote" w:semiHidden="0" w:uiPriority="29" w:unhideWhenUsed="0" w:qFormat="1"/>
-    <w:lsdException w:name="Intense Quote" w:semiHidden="0" w:uiPriority="30" w:unhideWhenUsed="0" w:qFormat="1"/>
-    <w:lsdException w:name="Medium List 2 Accent 1" w:semiHidden="0" w:uiPriority="66" w:unhideWhenUsed="0"/>
-    <w:lsdException w:name="Medium Grid 1 Accent 1" w:semiHidden="0" w:uiPriority="67" w:unhideWhenUsed="0"/>
-    <w:lsdException w:name="Medium Grid 2 Accent 1" w:semiHidden="0" w:uiPriority="68" w:unhideWhenUsed="0"/>
-    <w:lsdException w:name="Medium Grid 3 Accent 1" w:semiHidden="0" w:uiPriority="69" w:unhideWhenUsed="0"/>
-    <w:lsdException w:name="Dark List Accent 1" w:semiHidden="0" w:uiPriority="70" w:unhideWhenUsed="0"/>
-    <w:lsdException w:name="Colorful Shading Accent 1" w:semiHidden="0" w:uiPriority="71" w:unhideWhenUsed="0"/>
-    <w:lsdException w:name="Colorful List Accent 1" w:semiHidden="0" w:uiPriority="72" w:unhideWhenUsed="0"/>
-    <w:lsdException w:name="Colorful Grid Accent 1" w:semiHidden="0" w:uiPriority="73" w:unhideWhenUsed="0"/>
-    <w:lsdException w:name="Light Shading Accent 2" w:semiHidden="0" w:uiPriority="60" w:unhideWhenUsed="0"/>
-    <w:lsdException w:name="Light List Accent 2" w:semiHidden="0" w:uiPriority="61" w:unhideWhenUsed="0"/>
-    <w:lsdException w:name="Light Grid Accent 2" w:semiHidden="0" w:uiPriority="62" w:unhideWhenUsed="0"/>
-    <w:lsdException w:name="Medium Shading 1 Accent 2" w:semiHidden="0" w:uiPriority="63" w:unhideWhenUsed="0"/>
-    <w:lsdException w:name="Medium Shading 2 Accent 2" w:semiHidden="0" w:uiPriority="64" w:unhideWhenUsed="0"/>
-    <w:lsdException w:name="Medium List 1 Accent 2" w:semiHidden="0" w:uiPriority="65" w:unhideWhenUsed="0"/>
-    <w:lsdException w:name="Medium List 2 Accent 2" w:semiHidden="0" w:uiPriority="66" w:unhideWhenUsed="0"/>
-    <w:lsdException w:name="Medium Grid 1 Accent 2" w:semiHidden="0" w:uiPriority="67" w:unhideWhenUsed="0"/>
-    <w:lsdException w:name="Medium Grid 2 Accent 2" w:semiHidden="0" w:uiPriority="68" w:unhideWhenUsed="0"/>
-    <w:lsdException w:name="Medium Grid 3 Accent 2" w:semiHidden="0" w:uiPriority="69" w:unhideWhenUsed="0"/>
-    <w:lsdException w:name="Dark List Accent 2" w:semiHidden="0" w:uiPriority="70" w:unhideWhenUsed="0"/>
-    <w:lsdException w:name="Colorful Shading Accent 2" w:semiHidden="0" w:uiPriority="71" w:unhideWhenUsed="0"/>
-    <w:lsdException w:name="Colorful List Accent 2" w:semiHidden="0" w:uiPriority="72" w:unhideWhenUsed="0"/>
-    <w:lsdException w:name="Colorful Grid Accent 2" w:semiHidden="0" w:uiPriority="73" w:unhideWhenUsed="0"/>
-    <w:lsdException w:name="Light Shading Accent 3" w:semiHidden="0" w:uiPriority="60" w:unhideWhenUsed="0"/>
-    <w:lsdException w:name="Light List Accent 3" w:semiHidden="0" w:uiPriority="61" w:unhideWhenUsed="0"/>
-    <w:lsdException w:name="Light Grid Accent 3" w:semiHidden="0" w:uiPriority="62" w:unhideWhenUsed="0"/>
-    <w:lsdException w:name="Medium Shading 1 Accent 3" w:semiHidden="0" w:uiPriority="63" w:unhideWhenUsed="0"/>
-    <w:lsdException w:name="Medium Shading 2 Accent 3" w:semiHidden="0" w:uiPriority="64" w:unhideWhenUsed="0"/>
-    <w:lsdException w:name="Medium List 1 Accent 3" w:semiHidden="0" w:uiPriority="65" w:unhideWhenUsed="0"/>
-    <w:lsdException w:name="Medium List 2 Accent 3" w:semiHidden="0" w:uiPriority="66" w:unhideWhenUsed="0"/>
-    <w:lsdException w:name="Medium Grid 1 Accent 3" w:semiHidden="0" w:uiPriority="67" w:unhideWhenUsed="0"/>
-    <w:lsdException w:name="Medium Grid 2 Accent 3" w:semiHidden="0" w:uiPriority="68" w:unhideWhenUsed="0"/>
-    <w:lsdException w:name="Medium Grid 3 Accent 3" w:semiHidden="0" w:uiPriority="69" w:unhideWhenUsed="0"/>
-    <w:lsdException w:name="Dark List Accent 3" w:semiHidden="0" w:uiPriority="70" w:unhideWhenUsed="0"/>
-    <w:lsdException w:name="Colorful Shading Accent 3" w:semiHidden="0" w:uiPriority="71" w:unhideWhenUsed="0"/>
-    <w:lsdException w:name="Colorful List Accent 3" w:semiHidden="0" w:uiPriority="72" w:unhideWhenUsed="0"/>
-    <w:lsdException w:name="Colorful Grid Accent 3" w:semiHidden="0" w:uiPriority="73" w:unhideWhenUsed="0"/>
-    <w:lsdException w:name="Light Shading Accent 4" w:semiHidden="0" w:uiPriority="60" w:unhideWhenUsed="0"/>
-    <w:lsdException w:name="Light List Accent 4" w:semiHidden="0" w:uiPriority="61" w:unhideWhenUsed="0"/>
-    <w:lsdException w:name="Light Grid Accent 4" w:semiHidden="0" w:uiPriority="62" w:unhideWhenUsed="0"/>
-    <w:lsdException w:name="Medium Shading 1 Accent 4" w:semiHidden="0" w:uiPriority="63" w:unhideWhenUsed="0"/>
-    <w:lsdException w:name="Medium Shading 2 Accent 4" w:semiHidden="0" w:uiPriority="64" w:unhideWhenUsed="0"/>
-    <w:lsdException w:name="Medium List 1 Accent 4" w:semiHidden="0" w:uiPriority="65" w:unhideWhenUsed="0"/>
-    <w:lsdException w:name="Medium List 2 Accent 4" w:semiHidden="0" w:uiPriority="66" w:unhideWhenUsed="0"/>
-    <w:lsdException w:name="Medium Grid 1 Accent 4" w:semiHidden="0" w:uiPriority="67" w:unhideWhenUsed="0"/>
-    <w:lsdException w:name="Medium Grid 2 Accent 4" w:semiHidden="0" w:uiPriority="68" w:unhideWhenUsed="0"/>
-    <w:lsdException w:name="Medium Grid 3 Accent 4" w:semiHidden="0" w:uiPriority="69" w:unhideWhenUsed="0"/>
-    <w:lsdException w:name="Dark List Accent 4" w:semiHidden="0" w:uiPriority="70" w:unhideWhenUsed="0"/>
-    <w:lsdException w:name="Colorful Shading Accent 4" w:semiHidden="0" w:uiPriority="71" w:unhideWhenUsed="0"/>
-    <w:lsdException w:name="Colorful List Accent 4" w:semiHidden="0" w:uiPriority="72" w:unhideWhenUsed="0"/>
-    <w:lsdException w:name="Colorful Grid Accent 4" w:semiHidden="0" w:uiPriority="73" w:unhideWhenUsed="0"/>
-    <w:lsdException w:name="Light Shading Accent 5" w:semiHidden="0" w:uiPriority="60" w:unhideWhenUsed="0"/>
-    <w:lsdException w:name="Light List Accent 5" w:semiHidden="0" w:uiPriority="61" w:unhideWhenUsed="0"/>
-    <w:lsdException w:name="Light Grid Accent 5" w:semiHidden="0" w:uiPriority="62" w:unhideWhenUsed="0"/>
-    <w:lsdException w:name="Medium Shading 1 Accent 5" w:semiHidden="0" w:uiPriority="63" w:unhideWhenUsed="0"/>
-    <w:lsdException w:name="Medium Shading 2 Accent 5" w:semiHidden="0" w:uiPriority="64" w:unhideWhenUsed="0"/>
-    <w:lsdException w:name="Medium List 1 Accent 5" w:semiHidden="0" w:uiPriority="65" w:unhideWhenUsed="0"/>
-    <w:lsdException w:name="Medium List 2 Accent 5" w:semiHidden="0" w:uiPriority="66" w:unhideWhenUsed="0"/>
-    <w:lsdException w:name="Medium Grid 1 Accent 5" w:semiHidden="0" w:uiPriority="67" w:unhideWhenUsed="0"/>
-    <w:lsdException w:name="Medium Grid 2 Accent 5" w:semiHidden="0" w:uiPriority="68" w:unhideWhenUsed="0"/>
-    <w:lsdException w:name="Medium Grid 3 Accent 5" w:semiHidden="0" w:uiPriority="69" w:unhideWhenUsed="0"/>
-    <w:lsdException w:name="Dark List Accent 5" w:semiHidden="0" w:uiPriority="70" w:unhideWhenUsed="0"/>
-    <w:lsdException w:name="Colorful Shading Accent 5" w:semiHidden="0" w:uiPriority="71" w:unhideWhenUsed="0"/>
-    <w:lsdException w:name="Colorful List Accent 5" w:semiHidden="0" w:uiPriority="72" w:unhideWhenUsed="0"/>
-    <w:lsdException w:name="Colorful Grid Accent 5" w:semiHidden="0" w:uiPriority="73" w:unhideWhenUsed="0"/>
-    <w:lsdException w:name="Light Shading Accent 6" w:semiHidden="0" w:uiPriority="60" w:unhideWhenUsed="0"/>
-    <w:lsdException w:name="Light List Accent 6" w:semiHidden="0" w:uiPriority="61" w:unhideWhenUsed="0"/>
-    <w:lsdException w:name="Light Grid Accent 6" w:semiHidden="0" w:uiPriority="62" w:unhideWhenUsed="0"/>
-    <w:lsdException w:name="Medium Shading 1 Accent 6" w:semiHidden="0" w:uiPriority="63" w:unhideWhenUsed="0"/>
-    <w:lsdException w:name="Medium Shading 2 Accent 6" w:semiHidden="0" w:uiPriority="64" w:unhideWhenUsed="0"/>
-    <w:lsdException w:name="Medium List 1 Accent 6" w:semiHidden="0" w:uiPriority="65" w:unhideWhenUsed="0"/>
-    <w:lsdException w:name="Medium List 2 Accent 6" w:semiHidden="0" w:uiPriority="66" w:unhideWhenUsed="0"/>
-    <w:lsdException w:name="Medium Grid 1 Accent 6" w:semiHidden="0" w:uiPriority="67" w:unhideWhenUsed="0"/>
-    <w:lsdException w:name="Medium Grid 2 Accent 6" w:semiHidden="0" w:uiPriority="68" w:unhideWhenUsed="0"/>
-    <w:lsdException w:name="Medium Grid 3 Accent 6" w:semiHidden="0" w:uiPriority="69" w:unhideWhenUsed="0"/>
-    <w:lsdException w:name="Dark List Accent 6" w:semiHidden="0" w:uiPriority="70" w:unhideWhenUsed="0"/>
-    <w:lsdException w:name="Colorful Shading Accent 6" w:semiHidden="0" w:uiPriority="71" w:unhideWhenUsed="0"/>
-    <w:lsdException w:name="Colorful List Accent 6" w:semiHidden="0" w:uiPriority="72" w:unhideWhenUsed="0"/>
-    <w:lsdException w:name="Colorful Grid Accent 6" w:semiHidden="0" w:uiPriority="73" w:unhideWhenUsed="0"/>
-    <w:lsdException w:name="Subtle Emphasis" w:semiHidden="0" w:uiPriority="19" w:unhideWhenUsed="0" w:qFormat="1"/>
-    <w:lsdException w:name="Intense Emphasis" w:semiHidden="0" w:uiPriority="21" w:unhideWhenUsed="0" w:qFormat="1"/>
-    <w:lsdException w:name="Subtle Reference" w:semiHidden="0" w:uiPriority="31" w:unhideWhenUsed="0" w:qFormat="1"/>
-    <w:lsdException w:name="Intense Reference" w:semiHidden="0" w:uiPriority="32" w:unhideWhenUsed="0" w:qFormat="1"/>
-    <w:lsdException w:name="Book Title" w:semiHidden="0" w:uiPriority="33" w:unhideWhenUsed="0" w:qFormat="1"/>
-    <w:lsdException w:name="Bibliography" w:uiPriority="37"/>
-    <w:lsdException w:name="TOC Heading" w:uiPriority="39" w:qFormat="1"/>
+  <w:latentStyles w:defLockedState="0" w:defUIPriority="99" w:defSemiHidden="0" w:defUnhideWhenUsed="0" w:defQFormat="0" w:count="376">
+    <w:lsdException w:name="Normal" w:uiPriority="0" w:qFormat="1"/>
+    <w:lsdException w:name="heading 1" w:uiPriority="9" w:qFormat="1"/>
+    <w:lsdException w:name="heading 2" w:semiHidden="1" w:uiPriority="9" w:unhideWhenUsed="1" w:qFormat="1"/>
+    <w:lsdException w:name="heading 3" w:semiHidden="1" w:uiPriority="9" w:unhideWhenUsed="1" w:qFormat="1"/>
+    <w:lsdException w:name="heading 4" w:semiHidden="1" w:uiPriority="9" w:unhideWhenUsed="1" w:qFormat="1"/>
+    <w:lsdException w:name="heading 5" w:semiHidden="1" w:uiPriority="9" w:unhideWhenUsed="1" w:qFormat="1"/>
+    <w:lsdException w:name="heading 6" w:semiHidden="1" w:uiPriority="9" w:unhideWhenUsed="1" w:qFormat="1"/>
+    <w:lsdException w:name="heading 7" w:semiHidden="1" w:uiPriority="9" w:unhideWhenUsed="1" w:qFormat="1"/>
+    <w:lsdException w:name="heading 8" w:semiHidden="1" w:uiPriority="9" w:unhideWhenUsed="1" w:qFormat="1"/>
+    <w:lsdException w:name="heading 9" w:semiHidden="1" w:uiPriority="9" w:unhideWhenUsed="1" w:qFormat="1"/>
+    <w:lsdException w:name="index 1" w:semiHidden="1" w:unhideWhenUsed="1"/>
+    <w:lsdException w:name="index 2" w:semiHidden="1" w:unhideWhenUsed="1"/>
+    <w:lsdException w:name="index 3" w:semiHidden="1" w:unhideWhenUsed="1"/>
+    <w:lsdException w:name="index 4" w:semiHidden="1" w:unhideWhenUsed="1"/>
+    <w:lsdException w:name="index 5" w:semiHidden="1" w:unhideWhenUsed="1"/>
+    <w:lsdException w:name="index 6" w:semiHidden="1" w:unhideWhenUsed="1"/>
+    <w:lsdException w:name="index 7" w:semiHidden="1" w:unhideWhenUsed="1"/>
+    <w:lsdException w:name="index 8" w:semiHidden="1" w:unhideWhenUsed="1"/>
+    <w:lsdException w:name="index 9" w:semiHidden="1" w:unhideWhenUsed="1"/>
+    <w:lsdException w:name="toc 1" w:semiHidden="1" w:uiPriority="39" w:unhideWhenUsed="1"/>
+    <w:lsdException w:name="toc 2" w:semiHidden="1" w:uiPriority="39" w:unhideWhenUsed="1"/>
+    <w:lsdException w:name="toc 3" w:semiHidden="1" w:uiPriority="39" w:unhideWhenUsed="1"/>
+    <w:lsdException w:name="toc 4" w:semiHidden="1" w:uiPriority="39" w:unhideWhenUsed="1"/>
+    <w:lsdException w:name="toc 5" w:semiHidden="1" w:uiPriority="39" w:unhideWhenUsed="1"/>
+    <w:lsdException w:name="toc 6" w:semiHidden="1" w:uiPriority="39" w:unhideWhenUsed="1"/>
+    <w:lsdException w:name="toc 7" w:semiHidden="1" w:uiPriority="39" w:unhideWhenUsed="1"/>
+    <w:lsdException w:name="toc 8" w:semiHidden="1" w:uiPriority="39" w:unhideWhenUsed="1"/>
+    <w:lsdException w:name="toc 9" w:semiHidden="1" w:uiPriority="39" w:unhideWhenUsed="1"/>
+    <w:lsdException w:name="Normal Indent" w:semiHidden="1" w:unhideWhenUsed="1"/>
+    <w:lsdException w:name="footnote text" w:semiHidden="1" w:unhideWhenUsed="1"/>
+    <w:lsdException w:name="annotation text" w:semiHidden="1" w:unhideWhenUsed="1"/>
+    <w:lsdException w:name="header" w:semiHidden="1" w:unhideWhenUsed="1"/>
+    <w:lsdException w:name="footer" w:semiHidden="1" w:unhideWhenUsed="1"/>
+    <w:lsdException w:name="index heading" w:semiHidden="1" w:unhideWhenUsed="1"/>
+    <w:lsdException w:name="caption" w:semiHidden="1" w:uiPriority="35" w:unhideWhenUsed="1" w:qFormat="1"/>
+    <w:lsdException w:name="table of figures" w:semiHidden="1" w:unhideWhenUsed="1"/>
+    <w:lsdException w:name="envelope address" w:semiHidden="1" w:unhideWhenUsed="1"/>
+    <w:lsdException w:name="envelope return" w:semiHidden="1" w:unhideWhenUsed="1"/>
+    <w:lsdException w:name="footnote reference" w:semiHidden="1" w:unhideWhenUsed="1"/>
+    <w:lsdException w:name="annotation reference" w:semiHidden="1" w:unhideWhenUsed="1"/>
+    <w:lsdException w:name="line number" w:semiHidden="1" w:unhideWhenUsed="1"/>
+    <w:lsdException w:name="page number" w:semiHidden="1" w:unhideWhenUsed="1"/>
+    <w:lsdException w:name="endnote reference" w:semiHidden="1" w:unhideWhenUsed="1"/>
+    <w:lsdException w:name="endnote text" w:semiHidden="1" w:unhideWhenUsed="1"/>
+    <w:lsdException w:name="table of authorities" w:semiHidden="1" w:unhideWhenUsed="1"/>
+    <w:lsdException w:name="macro" w:semiHidden="1" w:unhideWhenUsed="1"/>
+    <w:lsdException w:name="toa heading" w:semiHidden="1" w:unhideWhenUsed="1"/>
+    <w:lsdException w:name="List" w:semiHidden="1" w:unhideWhenUsed="1"/>
+    <w:lsdException w:name="List Bullet" w:semiHidden="1" w:unhideWhenUsed="1"/>
+    <w:lsdException w:name="List Number" w:semiHidden="1" w:unhideWhenUsed="1"/>
+    <w:lsdException w:name="List 2" w:semiHidden="1" w:unhideWhenUsed="1"/>
+    <w:lsdException w:name="List 3" w:semiHidden="1" w:unhideWhenUsed="1"/>
+    <w:lsdException w:name="List 4" w:semiHidden="1" w:unhideWhenUsed="1"/>
+    <w:lsdException w:name="List 5" w:semiHidden="1" w:unhideWhenUsed="1"/>
+    <w:lsdException w:name="List Bullet 2" w:semiHidden="1" w:unhideWhenUsed="1"/>
+    <w:lsdException w:name="List Bullet 3" w:semiHidden="1" w:unhideWhenUsed="1"/>
+    <w:lsdException w:name="List Bullet 4" w:semiHidden="1" w:unhideWhenUsed="1"/>
+    <w:lsdException w:name="List Bullet 5" w:semiHidden="1" w:unhideWhenUsed="1"/>
+    <w:lsdException w:name="List Number 2" w:semiHidden="1" w:unhideWhenUsed="1"/>
+    <w:lsdException w:name="List Number 3" w:semiHidden="1" w:unhideWhenUsed="1"/>
+    <w:lsdException w:name="List Number 4" w:semiHidden="1" w:unhideWhenUsed="1"/>
+    <w:lsdException w:name="List Number 5" w:semiHidden="1" w:unhideWhenUsed="1"/>
+    <w:lsdException w:name="Title" w:uiPriority="10" w:qFormat="1"/>
+    <w:lsdException w:name="Closing" w:semiHidden="1" w:unhideWhenUsed="1"/>
+    <w:lsdException w:name="Signature" w:semiHidden="1" w:unhideWhenUsed="1"/>
+    <w:lsdException w:name="Default Paragraph Font" w:semiHidden="1" w:uiPriority="1" w:unhideWhenUsed="1"/>
+    <w:lsdException w:name="Body Text" w:semiHidden="1" w:unhideWhenUsed="1"/>
+    <w:lsdException w:name="Body Text Indent" w:semiHidden="1" w:unhideWhenUsed="1"/>
+    <w:lsdException w:name="List Continue" w:semiHidden="1" w:unhideWhenUsed="1"/>
+    <w:lsdException w:name="List Continue 2" w:semiHidden="1" w:unhideWhenUsed="1"/>
+    <w:lsdException w:name="List Continue 3" w:semiHidden="1" w:unhideWhenUsed="1"/>
+    <w:lsdException w:name="List Continue 4" w:semiHidden="1" w:unhideWhenUsed="1"/>
+    <w:lsdException w:name="List Continue 5" w:semiHidden="1" w:unhideWhenUsed="1"/>
+    <w:lsdException w:name="Message Header" w:semiHidden="1" w:unhideWhenUsed="1"/>
+    <w:lsdException w:name="Subtitle" w:uiPriority="11" w:qFormat="1"/>
+    <w:lsdException w:name="Salutation" w:semiHidden="1" w:unhideWhenUsed="1"/>
+    <w:lsdException w:name="Date" w:semiHidden="1" w:unhideWhenUsed="1"/>
+    <w:lsdException w:name="Body Text First Indent" w:semiHidden="1" w:unhideWhenUsed="1"/>
+    <w:lsdException w:name="Body Text First Indent 2" w:semiHidden="1" w:unhideWhenUsed="1"/>
+    <w:lsdException w:name="Note Heading" w:semiHidden="1" w:unhideWhenUsed="1"/>
+    <w:lsdException w:name="Body Text 2" w:semiHidden="1" w:unhideWhenUsed="1"/>
+    <w:lsdException w:name="Body Text 3" w:semiHidden="1" w:unhideWhenUsed="1"/>
+    <w:lsdException w:name="Body Text Indent 2" w:semiHidden="1" w:unhideWhenUsed="1"/>
+    <w:lsdException w:name="Body Text Indent 3" w:semiHidden="1" w:unhideWhenUsed="1"/>
+    <w:lsdException w:name="Block Text" w:semiHidden="1" w:unhideWhenUsed="1"/>
+    <w:lsdException w:name="Hyperlink" w:semiHidden="1" w:unhideWhenUsed="1"/>
+    <w:lsdException w:name="FollowedHyperlink" w:semiHidden="1" w:unhideWhenUsed="1"/>
+    <w:lsdException w:name="Strong" w:uiPriority="22" w:qFormat="1"/>
+    <w:lsdException w:name="Emphasis" w:uiPriority="20" w:qFormat="1"/>
+    <w:lsdException w:name="Document Map" w:semiHidden="1" w:unhideWhenUsed="1"/>
+    <w:lsdException w:name="Plain Text" w:semiHidden="1" w:unhideWhenUsed="1"/>
+    <w:lsdException w:name="E-mail Signature" w:semiHidden="1" w:unhideWhenUsed="1"/>
+    <w:lsdException w:name="HTML Top of Form" w:semiHidden="1" w:unhideWhenUsed="1"/>
+    <w:lsdException w:name="HTML Bottom of Form" w:semiHidden="1" w:unhideWhenUsed="1"/>
+    <w:lsdException w:name="Normal (Web)" w:semiHidden="1" w:unhideWhenUsed="1"/>
+    <w:lsdException w:name="HTML Acronym" w:semiHidden="1" w:unhideWhenUsed="1"/>
+    <w:lsdException w:name="HTML Address" w:semiHidden="1" w:unhideWhenUsed="1"/>
+    <w:lsdException w:name="HTML Cite" w:semiHidden="1" w:unhideWhenUsed="1"/>
+    <w:lsdException w:name="HTML Code" w:semiHidden="1" w:unhideWhenUsed="1"/>
+    <w:lsdException w:name="HTML Definition" w:semiHidden="1" w:unhideWhenUsed="1"/>
+    <w:lsdException w:name="HTML Keyboard" w:semiHidden="1" w:unhideWhenUsed="1"/>
+    <w:lsdException w:name="HTML Preformatted" w:semiHidden="1" w:unhideWhenUsed="1"/>
+    <w:lsdException w:name="HTML Sample" w:semiHidden="1" w:unhideWhenUsed="1"/>
+    <w:lsdException w:name="HTML Typewriter" w:semiHidden="1" w:unhideWhenUsed="1"/>
+    <w:lsdException w:name="HTML Variable" w:semiHidden="1" w:unhideWhenUsed="1"/>
+    <w:lsdException w:name="Normal Table" w:semiHidden="1" w:unhideWhenUsed="1"/>
+    <w:lsdException w:name="annotation subject" w:semiHidden="1" w:unhideWhenUsed="1"/>
+    <w:lsdException w:name="No List" w:semiHidden="1" w:unhideWhenUsed="1"/>
+    <w:lsdException w:name="Outline List 1" w:semiHidden="1" w:unhideWhenUsed="1"/>
+    <w:lsdException w:name="Outline List 2" w:semiHidden="1" w:unhideWhenUsed="1"/>
+    <w:lsdException w:name="Outline List 3" w:semiHidden="1" w:unhideWhenUsed="1"/>
+    <w:lsdException w:name="Table Simple 1" w:semiHidden="1" w:unhideWhenUsed="1"/>
+    <w:lsdException w:name="Table Simple 2" w:semiHidden="1" w:unhideWhenUsed="1"/>
+    <w:lsdException w:name="Table Simple 3" w:semiHidden="1" w:unhideWhenUsed="1"/>
+    <w:lsdException w:name="Table Classic 1" w:semiHidden="1" w:unhideWhenUsed="1"/>
+    <w:lsdException w:name="Table Classic 2" w:semiHidden="1" w:unhideWhenUsed="1"/>
+    <w:lsdException w:name="Table Classic 3" w:semiHidden="1" w:unhideWhenUsed="1"/>
+    <w:lsdException w:name="Table Classic 4" w:semiHidden="1" w:unhideWhenUsed="1"/>
+    <w:lsdException w:name="Table Colorful 1" w:semiHidden="1" w:unhideWhenUsed="1"/>
+    <w:lsdException w:name="Table Colorful 2" w:semiHidden="1" w:unhideWhenUsed="1"/>
+    <w:lsdException w:name="Table Colorful 3" w:semiHidden="1" w:unhideWhenUsed="1"/>
+    <w:lsdException w:name="Table Columns 1" w:semiHidden="1" w:unhideWhenUsed="1"/>
+    <w:lsdException w:name="Table Columns 2" w:semiHidden="1" w:unhideWhenUsed="1"/>
+    <w:lsdException w:name="Table Columns 3" w:semiHidden="1" w:unhideWhenUsed="1"/>
+    <w:lsdException w:name="Table Columns 4" w:semiHidden="1" w:unhideWhenUsed="1"/>
+    <w:lsdException w:name="Table Columns 5" w:semiHidden="1" w:unhideWhenUsed="1"/>
+    <w:lsdException w:name="Table Grid 1" w:semiHidden="1" w:unhideWhenUsed="1"/>
+    <w:lsdException w:name="Table Grid 2" w:semiHidden="1" w:unhideWhenUsed="1"/>
+    <w:lsdException w:name="Table Grid 3" w:semiHidden="1" w:unhideWhenUsed="1"/>
+    <w:lsdException w:name="Table Grid 4" w:semiHidden="1" w:unhideWhenUsed="1"/>
+    <w:lsdException w:name="Table Grid 5" w:semiHidden="1" w:unhideWhenUsed="1"/>
+    <w:lsdException w:name="Table Grid 6" w:semiHidden="1" w:unhideWhenUsed="1"/>
+    <w:lsdException w:name="Table Grid 7" w:semiHidden="1" w:unhideWhenUsed="1"/>
+    <w:lsdException w:name="Table Grid 8" w:semiHidden="1" w:unhideWhenUsed="1"/>
+    <w:lsdException w:name="Table List 1" w:semiHidden="1" w:unhideWhenUsed="1"/>
+    <w:lsdException w:name="Table List 2" w:semiHidden="1" w:unhideWhenUsed="1"/>
+    <w:lsdException w:name="Table List 3" w:semiHidden="1" w:unhideWhenUsed="1"/>
+    <w:lsdException w:name="Table List 4" w:semiHidden="1" w:unhideWhenUsed="1"/>
+    <w:lsdException w:name="Table List 5" w:semiHidden="1" w:unhideWhenUsed="1"/>
+    <w:lsdException w:name="Table List 6" w:semiHidden="1" w:unhideWhenUsed="1"/>
+    <w:lsdException w:name="Table List 7" w:semiHidden="1" w:unhideWhenUsed="1"/>
+    <w:lsdException w:name="Table List 8" w:semiHidden="1" w:unhideWhenUsed="1"/>
+    <w:lsdException w:name="Table 3D effects 1" w:semiHidden="1" w:unhideWhenUsed="1"/>
+    <w:lsdException w:name="Table 3D effects 2" w:semiHidden="1" w:unhideWhenUsed="1"/>
+    <w:lsdException w:name="Table 3D effects 3" w:semiHidden="1" w:unhideWhenUsed="1"/>
+    <w:lsdException w:name="Table Contemporary" w:semiHidden="1" w:unhideWhenUsed="1"/>
+    <w:lsdException w:name="Table Elegant" w:semiHidden="1" w:unhideWhenUsed="1"/>
+    <w:lsdException w:name="Table Professional" w:semiHidden="1" w:unhideWhenUsed="1"/>
+    <w:lsdException w:name="Table Subtle 1" w:semiHidden="1" w:unhideWhenUsed="1"/>
+    <w:lsdException w:name="Table Subtle 2" w:semiHidden="1" w:unhideWhenUsed="1"/>
+    <w:lsdException w:name="Table Web 1" w:semiHidden="1" w:unhideWhenUsed="1"/>
+    <w:lsdException w:name="Table Web 2" w:semiHidden="1" w:unhideWhenUsed="1"/>
+    <w:lsdException w:name="Table Web 3" w:semiHidden="1" w:unhideWhenUsed="1"/>
+    <w:lsdException w:name="Balloon Text" w:semiHidden="1" w:unhideWhenUsed="1"/>
+    <w:lsdException w:name="Table Grid" w:uiPriority="39"/>
+    <w:lsdException w:name="Table Theme" w:semiHidden="1" w:unhideWhenUsed="1"/>
+    <w:lsdException w:name="Placeholder Text" w:semiHidden="1"/>
+    <w:lsdException w:name="No Spacing" w:uiPriority="1" w:qFormat="1"/>
+    <w:lsdException w:name="Light Shading" w:uiPriority="60"/>
+    <w:lsdException w:name="Light List" w:uiPriority="61"/>
+    <w:lsdException w:name="Light Grid" w:uiPriority="62"/>
+    <w:lsdException w:name="Medium Shading 1" w:uiPriority="63"/>
+    <w:lsdException w:name="Medium Shading 2" w:uiPriority="64"/>
+    <w:lsdException w:name="Medium List 1" w:uiPriority="65"/>
+    <w:lsdException w:name="Medium List 2" w:uiPriority="66"/>
+    <w:lsdException w:name="Medium Grid 1" w:uiPriority="67"/>
+    <w:lsdException w:name="Medium Grid 2" w:uiPriority="68"/>
+    <w:lsdException w:name="Medium Grid 3" w:uiPriority="69"/>
+    <w:lsdException w:name="Dark List" w:uiPriority="70"/>
+    <w:lsdException w:name="Colorful Shading" w:uiPriority="71"/>
+    <w:lsdException w:name="Colorful List" w:uiPriority="72"/>
+    <w:lsdException w:name="Colorful Grid" w:uiPriority="73"/>
+    <w:lsdException w:name="Light Shading Accent 1" w:uiPriority="60"/>
+    <w:lsdException w:name="Light List Accent 1" w:uiPriority="61"/>
+    <w:lsdException w:name="Light Grid Accent 1" w:uiPriority="62"/>
+    <w:lsdException w:name="Medium Shading 1 Accent 1" w:uiPriority="63"/>
+    <w:lsdException w:name="Medium Shading 2 Accent 1" w:uiPriority="64"/>
+    <w:lsdException w:name="Medium List 1 Accent 1" w:uiPriority="65"/>
+    <w:lsdException w:name="Revision" w:semiHidden="1"/>
+    <w:lsdException w:name="List Paragraph" w:uiPriority="34" w:qFormat="1"/>
+    <w:lsdException w:name="Quote" w:uiPriority="29" w:qFormat="1"/>
+    <w:lsdException w:name="Intense Quote" w:uiPriority="30" w:qFormat="1"/>
+    <w:lsdException w:name="Medium List 2 Accent 1" w:uiPriority="66"/>
+    <w:lsdException w:name="Medium Grid 1 Accent 1" w:uiPriority="67"/>
+    <w:lsdException w:name="Medium Grid 2 Accent 1" w:uiPriority="68"/>
+    <w:lsdException w:name="Medium Grid 3 Accent 1" w:uiPriority="69"/>
+    <w:lsdException w:name="Dark List Accent 1" w:uiPriority="70"/>
+    <w:lsdException w:name="Colorful Shading Accent 1" w:uiPriority="71"/>
+    <w:lsdException w:name="Colorful List Accent 1" w:uiPriority="72"/>
+    <w:lsdException w:name="Colorful Grid Accent 1" w:uiPriority="73"/>
+    <w:lsdException w:name="Light Shading Accent 2" w:uiPriority="60"/>
+    <w:lsdException w:name="Light List Accent 2" w:uiPriority="61"/>
+    <w:lsdException w:name="Light Grid Accent 2" w:uiPriority="62"/>
+    <w:lsdException w:name="Medium Shading 1 Accent 2" w:uiPriority="63"/>
+    <w:lsdException w:name="Medium Shading 2 Accent 2" w:uiPriority="64"/>
+    <w:lsdException w:name="Medium List 1 Accent 2" w:uiPriority="65"/>
+    <w:lsdException w:name="Medium List 2 Accent 2" w:uiPriority="66"/>
+    <w:lsdException w:name="Medium Grid 1 Accent 2" w:uiPriority="67"/>
+    <w:lsdException w:name="Medium Grid 2 Accent 2" w:uiPriority="68"/>
+    <w:lsdException w:name="Medium Grid 3 Accent 2" w:uiPriority="69"/>
+    <w:lsdException w:name="Dark List Accent 2" w:uiPriority="70"/>
+    <w:lsdException w:name="Colorful Shading Accent 2" w:uiPriority="71"/>
+    <w:lsdException w:name="Colorful List Accent 2" w:uiPriority="72"/>
+    <w:lsdException w:name="Colorful Grid Accent 2" w:uiPriority="73"/>
+    <w:lsdException w:name="Light Shading Accent 3" w:uiPriority="60"/>
+    <w:lsdException w:name="Light List Accent 3" w:uiPriority="61"/>
+    <w:lsdException w:name="Light Grid Accent 3" w:uiPriority="62"/>
+    <w:lsdException w:name="Medium Shading 1 Accent 3" w:uiPriority="63"/>
+    <w:lsdException w:name="Medium Shading 2 Accent 3" w:uiPriority="64"/>
+    <w:lsdException w:name="Medium List 1 Accent 3" w:uiPriority="65"/>
+    <w:lsdException w:name="Medium List 2 Accent 3" w:uiPriority="66"/>
+    <w:lsdException w:name="Medium Grid 1 Accent 3" w:uiPriority="67"/>
+    <w:lsdException w:name="Medium Grid 2 Accent 3" w:uiPriority="68"/>
+    <w:lsdException w:name="Medium Grid 3 Accent 3" w:uiPriority="69"/>
+    <w:lsdException w:name="Dark List Accent 3" w:uiPriority="70"/>
+    <w:lsdException w:name="Colorful Shading Accent 3" w:uiPriority="71"/>
+    <w:lsdException w:name="Colorful List Accent 3" w:uiPriority="72"/>
+    <w:lsdException w:name="Colorful Grid Accent 3" w:uiPriority="73"/>
+    <w:lsdException w:name="Light Shading Accent 4" w:uiPriority="60"/>
+    <w:lsdException w:name="Light List Accent 4" w:uiPriority="61"/>
+    <w:lsdException w:name="Light Grid Accent 4" w:uiPriority="62"/>
+    <w:lsdException w:name="Medium Shading 1 Accent 4" w:uiPriority="63"/>
+    <w:lsdException w:name="Medium Shading 2 Accent 4" w:uiPriority="64"/>
+    <w:lsdException w:name="Medium List 1 Accent 4" w:uiPriority="65"/>
+    <w:lsdException w:name="Medium List 2 Accent 4" w:uiPriority="66"/>
+    <w:lsdException w:name="Medium Grid 1 Accent 4" w:uiPriority="67"/>
+    <w:lsdException w:name="Medium Grid 2 Accent 4" w:uiPriority="68"/>
+    <w:lsdException w:name="Medium Grid 3 Accent 4" w:uiPriority="69"/>
+    <w:lsdException w:name="Dark List Accent 4" w:uiPriority="70"/>
+    <w:lsdException w:name="Colorful Shading Accent 4" w:uiPriority="71"/>
+    <w:lsdException w:name="Colorful List Accent 4" w:uiPriority="72"/>
+    <w:lsdException w:name="Colorful Grid Accent 4" w:uiPriority="73"/>
+    <w:lsdException w:name="Light Shading Accent 5" w:uiPriority="60"/>
+    <w:lsdException w:name="Light List Accent 5" w:uiPriority="61"/>
+    <w:lsdException w:name="Light Grid Accent 5" w:uiPriority="62"/>
+    <w:lsdException w:name="Medium Shading 1 Accent 5" w:uiPriority="63"/>
+    <w:lsdException w:name="Medium Shading 2 Accent 5" w:uiPriority="64"/>
+    <w:lsdException w:name="Medium List 1 Accent 5" w:uiPriority="65"/>
+    <w:lsdException w:name="Medium List 2 Accent 5" w:uiPriority="66"/>
+    <w:lsdException w:name="Medium Grid 1 Accent 5" w:uiPriority="67"/>
+    <w:lsdException w:name="Medium Grid 2 Accent 5" w:uiPriority="68"/>
+    <w:lsdException w:name="Medium Grid 3 Accent 5" w:uiPriority="69"/>
+    <w:lsdException w:name="Dark List Accent 5" w:uiPriority="70"/>
+    <w:lsdException w:name="Colorful Shading Accent 5" w:uiPriority="71"/>
+    <w:lsdException w:name="Colorful List Accent 5" w:uiPriority="72"/>
+    <w:lsdException w:name="Colorful Grid Accent 5" w:uiPriority="73"/>
+    <w:lsdException w:name="Light Shading Accent 6" w:uiPriority="60"/>
+    <w:lsdException w:name="Light List Accent 6" w:uiPriority="61"/>
+    <w:lsdException w:name="Light Grid Accent 6" w:uiPriority="62"/>
+    <w:lsdException w:name="Medium Shading 1 Accent 6" w:uiPriority="63"/>
+    <w:lsdException w:name="Medium Shading 2 Accent 6" w:uiPriority="64"/>
+    <w:lsdException w:name="Medium List 1 Accent 6" w:uiPriority="65"/>
+    <w:lsdException w:name="Medium List 2 Accent 6" w:uiPriority="66"/>
+    <w:lsdException w:name="Medium Grid 1 Accent 6" w:uiPriority="67"/>
+    <w:lsdException w:name="Medium Grid 2 Accent 6" w:uiPriority="68"/>
+    <w:lsdException w:name="Medium Grid 3 Accent 6" w:uiPriority="69"/>
+    <w:lsdException w:name="Dark List Accent 6" w:uiPriority="70"/>
+    <w:lsdException w:name="Colorful Shading Accent 6" w:uiPriority="71"/>
+    <w:lsdException w:name="Colorful List Accent 6" w:uiPriority="72"/>
+    <w:lsdException w:name="Colorful Grid Accent 6" w:uiPriority="73"/>
+    <w:lsdException w:name="Subtle Emphasis" w:uiPriority="19" w:qFormat="1"/>
+    <w:lsdException w:name="Intense Emphasis" w:uiPriority="21" w:qFormat="1"/>
+    <w:lsdException w:name="Subtle Reference" w:uiPriority="31" w:qFormat="1"/>
+    <w:lsdException w:name="Intense Reference" w:uiPriority="32" w:qFormat="1"/>
+    <w:lsdException w:name="Book Title" w:uiPriority="33" w:qFormat="1"/>
+    <w:lsdException w:name="Bibliography" w:semiHidden="1" w:uiPriority="37" w:unhideWhenUsed="1"/>
+    <w:lsdException w:name="TOC Heading" w:semiHidden="1" w:uiPriority="39" w:unhideWhenUsed="1" w:qFormat="1"/>
+    <w:lsdException w:name="Plain Table 1" w:uiPriority="41"/>
+    <w:lsdException w:name="Plain Table 2" w:uiPriority="42"/>
+    <w:lsdException w:name="Plain Table 3" w:uiPriority="43"/>
+    <w:lsdException w:name="Plain Table 4" w:uiPriority="44"/>
+    <w:lsdException w:name="Plain Table 5" w:uiPriority="45"/>
+    <w:lsdException w:name="Grid Table Light" w:uiPriority="40"/>
+    <w:lsdException w:name="Grid Table 1 Light" w:uiPriority="46"/>
+    <w:lsdException w:name="Grid Table 2" w:uiPriority="47"/>
+    <w:lsdException w:name="Grid Table 3" w:uiPriority="48"/>
+    <w:lsdException w:name="Grid Table 4" w:uiPriority="49"/>
+    <w:lsdException w:name="Grid Table 5 Dark" w:uiPriority="50"/>
+    <w:lsdException w:name="Grid Table 6 Colorful" w:uiPriority="51"/>
+    <w:lsdException w:name="Grid Table 7 Colorful" w:uiPriority="52"/>
+    <w:lsdException w:name="Grid Table 1 Light Accent 1" w:uiPriority="46"/>
+    <w:lsdException w:name="Grid Table 2 Accent 1" w:uiPriority="47"/>
+    <w:lsdException w:name="Grid Table 3 Accent 1" w:uiPriority="48"/>
+    <w:lsdException w:name="Grid Table 4 Accent 1" w:uiPriority="49"/>
+    <w:lsdException w:name="Grid Table 5 Dark Accent 1" w:uiPriority="50"/>
+    <w:lsdException w:name="Grid Table 6 Colorful Accent 1" w:uiPriority="51"/>
+    <w:lsdException w:name="Grid Table 7 Colorful Accent 1" w:uiPriority="52"/>
+    <w:lsdException w:name="Grid Table 1 Light Accent 2" w:uiPriority="46"/>
+    <w:lsdException w:name="Grid Table 2 Accent 2" w:uiPriority="47"/>
+    <w:lsdException w:name="Grid Table 3 Accent 2" w:uiPriority="48"/>
+    <w:lsdException w:name="Grid Table 4 Accent 2" w:uiPriority="49"/>
+    <w:lsdException w:name="Grid Table 5 Dark Accent 2" w:uiPriority="50"/>
+    <w:lsdException w:name="Grid Table 6 Colorful Accent 2" w:uiPriority="51"/>
+    <w:lsdException w:name="Grid Table 7 Colorful Accent 2" w:uiPriority="52"/>
+    <w:lsdException w:name="Grid Table 1 Light Accent 3" w:uiPriority="46"/>
+    <w:lsdException w:name="Grid Table 2 Accent 3" w:uiPriority="47"/>
+    <w:lsdException w:name="Grid Table 3 Accent 3" w:uiPriority="48"/>
+    <w:lsdException w:name="Grid Table 4 Accent 3" w:uiPriority="49"/>
+    <w:lsdException w:name="Grid Table 5 Dark Accent 3" w:uiPriority="50"/>
+    <w:lsdException w:name="Grid Table 6 Colorful Accent 3" w:uiPriority="51"/>
+    <w:lsdException w:name="Grid Table 7 Colorful Accent 3" w:uiPriority="52"/>
+    <w:lsdException w:name="Grid Table 1 Light Accent 4" w:uiPriority="46"/>
+    <w:lsdException w:name="Grid Table 2 Accent 4" w:uiPriority="47"/>
+    <w:lsdException w:name="Grid Table 3 Accent 4" w:uiPriority="48"/>
+    <w:lsdException w:name="Grid Table 4 Accent 4" w:uiPriority="49"/>
+    <w:lsdException w:name="Grid Table 5 Dark Accent 4" w:uiPriority="50"/>
+    <w:lsdException w:name="Grid Table 6 Colorful Accent 4" w:uiPriority="51"/>
+    <w:lsdException w:name="Grid Table 7 Colorful Accent 4" w:uiPriority="52"/>
+    <w:lsdException w:name="Grid Table 1 Light Accent 5" w:uiPriority="46"/>
+    <w:lsdException w:name="Grid Table 2 Accent 5" w:uiPriority="47"/>
+    <w:lsdException w:name="Grid Table 3 Accent 5" w:uiPriority="48"/>
+    <w:lsdException w:name="Grid Table 4 Accent 5" w:uiPriority="49"/>
+    <w:lsdException w:name="Grid Table 5 Dark Accent 5" w:uiPriority="50"/>
+    <w:lsdException w:name="Grid Table 6 Colorful Accent 5" w:uiPriority="51"/>
+    <w:lsdException w:name="Grid Table 7 Colorful Accent 5" w:uiPriority="52"/>
+    <w:lsdException w:name="Grid Table 1 Light Accent 6" w:uiPriority="46"/>
+    <w:lsdException w:name="Grid Table 2 Accent 6" w:uiPriority="47"/>
+    <w:lsdException w:name="Grid Table 3 Accent 6" w:uiPriority="48"/>
+    <w:lsdException w:name="Grid Table 4 Accent 6" w:uiPriority="49"/>
+    <w:lsdException w:name="Grid Table 5 Dark Accent 6" w:uiPriority="50"/>
+    <w:lsdException w:name="Grid Table 6 Colorful Accent 6" w:uiPriority="51"/>
+    <w:lsdException w:name="Grid Table 7 Colorful Accent 6" w:uiPriority="52"/>
+    <w:lsdException w:name="List Table 1 Light" w:uiPriority="46"/>
+    <w:lsdException w:name="List Table 2" w:uiPriority="47"/>
+    <w:lsdException w:name="List Table 3" w:uiPriority="48"/>
+    <w:lsdException w:name="List Table 4" w:uiPriority="49"/>
+    <w:lsdException w:name="List Table 5 Dark" w:uiPriority="50"/>
+    <w:lsdException w:name="List Table 6 Colorful" w:uiPriority="51"/>
+    <w:lsdException w:name="List Table 7 Colorful" w:uiPriority="52"/>
+    <w:lsdException w:name="List Table 1 Light Accent 1" w:uiPriority="46"/>
+    <w:lsdException w:name="List Table 2 Accent 1" w:uiPriority="47"/>
+    <w:lsdException w:name="List Table 3 Accent 1" w:uiPriority="48"/>
+    <w:lsdException w:name="List Table 4 Accent 1" w:uiPriority="49"/>
+    <w:lsdException w:name="List Table 5 Dark Accent 1" w:uiPriority="50"/>
+    <w:lsdException w:name="List Table 6 Colorful Accent 1" w:uiPriority="51"/>
+    <w:lsdException w:name="List Table 7 Colorful Accent 1" w:uiPriority="52"/>
+    <w:lsdException w:name="List Table 1 Light Accent 2" w:uiPriority="46"/>
+    <w:lsdException w:name="List Table 2 Accent 2" w:uiPriority="47"/>
+    <w:lsdException w:name="List Table 3 Accent 2" w:uiPriority="48"/>
+    <w:lsdException w:name="List Table 4 Accent 2" w:uiPriority="49"/>
+    <w:lsdException w:name="List Table 5 Dark Accent 2" w:uiPriority="50"/>
+    <w:lsdException w:name="List Table 6 Colorful Accent 2" w:uiPriority="51"/>
+    <w:lsdException w:name="List Table 7 Colorful Accent 2" w:uiPriority="52"/>
+    <w:lsdException w:name="List Table 1 Light Accent 3" w:uiPriority="46"/>
+    <w:lsdException w:name="List Table 2 Accent 3" w:uiPriority="47"/>
+    <w:lsdException w:name="List Table 3 Accent 3" w:uiPriority="48"/>
+    <w:lsdException w:name="List Table 4 Accent 3" w:uiPriority="49"/>
+    <w:lsdException w:name="List Table 5 Dark Accent 3" w:uiPriority="50"/>
+    <w:lsdException w:name="List Table 6 Colorful Accent 3" w:uiPriority="51"/>
+    <w:lsdException w:name="List Table 7 Colorful Accent 3" w:uiPriority="52"/>
+    <w:lsdException w:name="List Table 1 Light Accent 4" w:uiPriority="46"/>
+    <w:lsdException w:name="List Table 2 Accent 4" w:uiPriority="47"/>
+    <w:lsdException w:name="List Table 3 Accent 4" w:uiPriority="48"/>
+    <w:lsdException w:name="List Table 4 Accent 4" w:uiPriority="49"/>
+    <w:lsdException w:name="List Table 5 Dark Accent 4" w:uiPriority="50"/>
+    <w:lsdException w:name="List Table 6 Colorful Accent 4" w:uiPriority="51"/>
+    <w:lsdException w:name="List Table 7 Colorful Accent 4" w:uiPriority="52"/>
+    <w:lsdException w:name="List Table 1 Light Accent 5" w:uiPriority="46"/>
+    <w:lsdException w:name="List Table 2 Accent 5" w:uiPriority="47"/>
+    <w:lsdException w:name="List Table 3 Accent 5" w:uiPriority="48"/>
+    <w:lsdException w:name="List Table 4 Accent 5" w:uiPriority="49"/>
+    <w:lsdException w:name="List Table 5 Dark Accent 5" w:uiPriority="50"/>
+    <w:lsdException w:name="List Table 6 Colorful Accent 5" w:uiPriority="51"/>
+    <w:lsdException w:name="List Table 7 Colorful Accent 5" w:uiPriority="52"/>
+    <w:lsdException w:name="List Table 1 Light Accent 6" w:uiPriority="46"/>
+    <w:lsdException w:name="List Table 2 Accent 6" w:uiPriority="47"/>
+    <w:lsdException w:name="List Table 3 Accent 6" w:uiPriority="48"/>
+    <w:lsdException w:name="List Table 4 Accent 6" w:uiPriority="49"/>
+    <w:lsdException w:name="List Table 5 Dark Accent 6" w:uiPriority="50"/>
+    <w:lsdException w:name="List Table 6 Colorful Accent 6" w:uiPriority="51"/>
+    <w:lsdException w:name="List Table 7 Colorful Accent 6" w:uiPriority="52"/>
+    <w:lsdException w:name="Mention" w:semiHidden="1" w:unhideWhenUsed="1"/>
+    <w:lsdException w:name="Smart Hyperlink" w:semiHidden="1" w:unhideWhenUsed="1"/>
+    <w:lsdException w:name="Hashtag" w:semiHidden="1" w:unhideWhenUsed="1"/>
+    <w:lsdException w:name="Unresolved Mention" w:semiHidden="1" w:unhideWhenUsed="1"/>
+    <w:lsdException w:name="Smart Link" w:semiHidden="1" w:unhideWhenUsed="1"/>
   </w:latentStyles>
   <w:style w:type="paragraph" w:default="1" w:styleId="Normal">
     <w:name w:val="Normal"/>
@@ -2933,7 +2353,7 @@
   <a:extraClrSchemeLst/>
   <a:extLst>
     <a:ext uri="{05A4C25C-085E-4340-85A3-A5531E510DB2}">
-      <thm15:themeFamily xmlns:thm15="http://schemas.microsoft.com/office/thememl/2012/main" xmlns="" name="Office Theme" id="{62F939B6-93AF-4DB8-9C6B-D6C7DFDC589F}" vid="{4A3C46E8-61CC-4603-A589-7422A47A8E4A}"/>
+      <thm15:themeFamily xmlns:thm15="http://schemas.microsoft.com/office/thememl/2012/main" name="Office Theme" id="{62F939B6-93AF-4DB8-9C6B-D6C7DFDC589F}" vid="{4A3C46E8-61CC-4603-A589-7422A47A8E4A}"/>
     </a:ext>
   </a:extLst>
 </a:theme>

</xml_diff>